<commit_message>
docs: update project documentation for DATTCNPM Smart Travel Guide
</commit_message>
<xml_diff>
--- a/DATTCNPM_Smart_Travel_Guide.docx
+++ b/DATTCNPM_Smart_Travel_Guide.docx
@@ -1,10 +1,10 @@
 
 <file path=word/document.xml><?xml version="1.0" encoding="utf-8"?>
-<w:document xmlns:wpc="http://schemas.microsoft.com/office/word/2010/wordprocessingCanvas" xmlns:cx="http://schemas.microsoft.com/office/drawing/2014/chartex" xmlns:mc="http://schemas.openxmlformats.org/markup-compatibility/2006" xmlns:o="urn:schemas-microsoft-com:office:office" xmlns:r="http://schemas.openxmlformats.org/officeDocument/2006/relationships" xmlns:m="http://schemas.openxmlformats.org/officeDocument/2006/math" xmlns:v="urn:schemas-microsoft-com:vml" xmlns:wp14="http://schemas.microsoft.com/office/word/2010/wordprocessingDrawing" xmlns:wp="http://schemas.openxmlformats.org/drawingml/2006/wordprocessingDrawing" xmlns:w10="urn:schemas-microsoft-com:office:word" xmlns:w="http://schemas.openxmlformats.org/wordprocessingml/2006/main" xmlns:w14="http://schemas.microsoft.com/office/word/2010/wordml" xmlns:w15="http://schemas.microsoft.com/office/word/2012/wordml" xmlns:w16se="http://schemas.microsoft.com/office/word/2015/wordml/symex" xmlns:wpg="http://schemas.microsoft.com/office/word/2010/wordprocessingGroup" xmlns:wpi="http://schemas.microsoft.com/office/word/2010/wordprocessingInk" xmlns:wne="http://schemas.microsoft.com/office/word/2006/wordml" xmlns:wps="http://schemas.microsoft.com/office/word/2010/wordprocessingShape" mc:Ignorable="w14 w15 w16se wp14">
+<w:document xmlns:wpc="http://schemas.microsoft.com/office/word/2010/wordprocessingCanvas" xmlns:cx="http://schemas.microsoft.com/office/drawing/2014/chartex" xmlns:cx1="http://schemas.microsoft.com/office/drawing/2015/9/8/chartex" xmlns:cx2="http://schemas.microsoft.com/office/drawing/2015/10/21/chartex" xmlns:cx3="http://schemas.microsoft.com/office/drawing/2016/5/9/chartex" xmlns:cx4="http://schemas.microsoft.com/office/drawing/2016/5/10/chartex" xmlns:cx5="http://schemas.microsoft.com/office/drawing/2016/5/11/chartex" xmlns:cx6="http://schemas.microsoft.com/office/drawing/2016/5/12/chartex" xmlns:cx7="http://schemas.microsoft.com/office/drawing/2016/5/13/chartex" xmlns:cx8="http://schemas.microsoft.com/office/drawing/2016/5/14/chartex" xmlns:mc="http://schemas.openxmlformats.org/markup-compatibility/2006" xmlns:aink="http://schemas.microsoft.com/office/drawing/2016/ink" xmlns:am3d="http://schemas.microsoft.com/office/drawing/2017/model3d" xmlns:o="urn:schemas-microsoft-com:office:office" xmlns:oel="http://schemas.microsoft.com/office/2019/extlst" xmlns:r="http://schemas.openxmlformats.org/officeDocument/2006/relationships" xmlns:m="http://schemas.openxmlformats.org/officeDocument/2006/math" xmlns:v="urn:schemas-microsoft-com:vml" xmlns:wp14="http://schemas.microsoft.com/office/word/2010/wordprocessingDrawing" xmlns:wp="http://schemas.openxmlformats.org/drawingml/2006/wordprocessingDrawing" xmlns:w10="urn:schemas-microsoft-com:office:word" xmlns:w="http://schemas.openxmlformats.org/wordprocessingml/2006/main" xmlns:w14="http://schemas.microsoft.com/office/word/2010/wordml" xmlns:w15="http://schemas.microsoft.com/office/word/2012/wordml" xmlns:w16cex="http://schemas.microsoft.com/office/word/2018/wordml/cex" xmlns:w16cid="http://schemas.microsoft.com/office/word/2016/wordml/cid" xmlns:w16="http://schemas.microsoft.com/office/word/2018/wordml" xmlns:w16du="http://schemas.microsoft.com/office/word/2023/wordml/word16du" xmlns:w16sdtdh="http://schemas.microsoft.com/office/word/2020/wordml/sdtdatahash" xmlns:w16sdtfl="http://schemas.microsoft.com/office/word/2024/wordml/sdtformatlock" xmlns:w16se="http://schemas.microsoft.com/office/word/2015/wordml/symex" xmlns:wpg="http://schemas.microsoft.com/office/word/2010/wordprocessingGroup" xmlns:wpi="http://schemas.microsoft.com/office/word/2010/wordprocessingInk" xmlns:wne="http://schemas.microsoft.com/office/word/2006/wordml" xmlns:wps="http://schemas.microsoft.com/office/word/2010/wordprocessingShape" mc:Ignorable="w14 w15 w16se w16cid w16 w16cex w16sdtdh w16sdtfl w16du wp14">
   <w:body>
     <w:p>
       <w:pPr>
-        <w:pStyle w:val="ListParagraph"/>
+        <w:pStyle w:val="oancuaDanhsach"/>
         <w:spacing w:before="0" w:line="240" w:lineRule="auto"/>
         <w:ind w:firstLine="0"/>
         <w:jc w:val="center"/>
@@ -154,7 +154,7 @@
           </mc:Choice>
           <mc:Fallback>
             <w:pict>
-              <v:group w14:anchorId="3F230DB5" id="Group 3" o:spid="_x0000_s1026" style="position:absolute;left:0;text-align:left;margin-left:-304.1pt;margin-top:-23.25pt;width:772.7pt;height:719.1pt;z-index:-251657216;mso-position-horizontal-relative:margin;mso-width-relative:margin;mso-height-relative:margin" coordorigin="22369,8199" coordsize="98771,99740" o:gfxdata="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">
+              <v:group w14:anchorId="3F230DB5" id="Group 3" o:spid="_x0000_s1026" style="position:absolute;left:0;text-align:left;margin-left:-304.1pt;margin-top:-23.25pt;width:772.7pt;height:719.1pt;z-index:-251657216;mso-position-horizontal-relative:margin;mso-width-relative:margin;mso-height-relative:margin" coordorigin="22369,8199" coordsize="98771,99740" o:gfxdata="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">
                 <v:shapetype id="_x0000_t75" coordsize="21600,21600" o:spt="75" o:preferrelative="t" path="m@4@5l@4@11@9@11@9@5xe" filled="f" stroked="f">
                   <v:stroke joinstyle="miter"/>
                   <v:formulas>
@@ -257,7 +257,7 @@
     </w:p>
     <w:p>
       <w:pPr>
-        <w:pStyle w:val="ListParagraph"/>
+        <w:pStyle w:val="oancuaDanhsach"/>
         <w:spacing w:before="0" w:line="240" w:lineRule="auto"/>
         <w:ind w:firstLine="0"/>
         <w:jc w:val="center"/>
@@ -438,7 +438,7 @@
     </w:p>
     <w:tbl>
       <w:tblPr>
-        <w:tblStyle w:val="TableGrid"/>
+        <w:tblStyle w:val="LiBang"/>
         <w:tblpPr w:leftFromText="180" w:rightFromText="180" w:vertAnchor="text" w:tblpXSpec="center" w:tblpY="-34"/>
         <w:tblW w:w="0" w:type="auto"/>
         <w:jc w:val="center"/>
@@ -683,7 +683,7 @@
     </w:p>
     <w:p>
       <w:pPr>
-        <w:pStyle w:val="Heading1"/>
+        <w:pStyle w:val="u1"/>
         <w:pageBreakBefore/>
         <w:spacing w:after="240"/>
         <w:rPr>
@@ -857,7 +857,7 @@
     </w:p>
     <w:p>
       <w:pPr>
-        <w:pStyle w:val="TOC1"/>
+        <w:pStyle w:val="Mucluc1"/>
         <w:tabs>
           <w:tab w:val="right" w:leader="dot" w:pos="9019"/>
         </w:tabs>
@@ -879,7 +879,7 @@
       <w:hyperlink w:anchor="_Toc234651159" w:history="1">
         <w:r>
           <w:rPr>
-            <w:rStyle w:val="Hyperlink"/>
+            <w:rStyle w:val="Siuktni"/>
             <w:bCs/>
             <w:noProof/>
             <w:lang w:val="vi-VN"/>
@@ -938,7 +938,7 @@
     </w:p>
     <w:p>
       <w:pPr>
-        <w:pStyle w:val="TOC1"/>
+        <w:pStyle w:val="Mucluc1"/>
         <w:tabs>
           <w:tab w:val="right" w:leader="dot" w:pos="9019"/>
         </w:tabs>
@@ -951,7 +951,7 @@
       <w:hyperlink w:anchor="_Toc234651160" w:history="1">
         <w:r>
           <w:rPr>
-            <w:rStyle w:val="Hyperlink"/>
+            <w:rStyle w:val="Siuktni"/>
             <w:noProof/>
           </w:rPr>
           <w:t>DANH MỤC TỪ VIẾT TẮT</w:t>
@@ -1008,7 +1008,7 @@
     </w:p>
     <w:p>
       <w:pPr>
-        <w:pStyle w:val="TOC1"/>
+        <w:pStyle w:val="Mucluc1"/>
         <w:tabs>
           <w:tab w:val="right" w:leader="dot" w:pos="9019"/>
         </w:tabs>
@@ -1021,7 +1021,7 @@
       <w:hyperlink w:anchor="_Toc234651161" w:history="1">
         <w:r>
           <w:rPr>
-            <w:rStyle w:val="Hyperlink"/>
+            <w:rStyle w:val="Siuktni"/>
             <w:noProof/>
           </w:rPr>
           <w:t>DANH MỤC HÌNH</w:t>
@@ -1078,7 +1078,7 @@
     </w:p>
     <w:p>
       <w:pPr>
-        <w:pStyle w:val="TOC1"/>
+        <w:pStyle w:val="Mucluc1"/>
         <w:tabs>
           <w:tab w:val="right" w:leader="dot" w:pos="9019"/>
         </w:tabs>
@@ -1091,7 +1091,7 @@
       <w:hyperlink w:anchor="_Toc234651162" w:history="1">
         <w:r>
           <w:rPr>
-            <w:rStyle w:val="Hyperlink"/>
+            <w:rStyle w:val="Siuktni"/>
             <w:noProof/>
           </w:rPr>
           <w:t>1. ĐẶC TẢ YÊU CẦU PHẦN MỀM (SRS)</w:t>
@@ -1148,7 +1148,7 @@
     </w:p>
     <w:p>
       <w:pPr>
-        <w:pStyle w:val="TOC2"/>
+        <w:pStyle w:val="Mucluc2"/>
         <w:tabs>
           <w:tab w:val="right" w:leader="dot" w:pos="9019"/>
         </w:tabs>
@@ -1161,7 +1161,7 @@
       <w:hyperlink w:anchor="_Toc234651163" w:history="1">
         <w:r>
           <w:rPr>
-            <w:rStyle w:val="Hyperlink"/>
+            <w:rStyle w:val="Siuktni"/>
             <w:noProof/>
           </w:rPr>
           <w:t>1.1. Mục đích tài liệu</w:t>
@@ -1218,7 +1218,7 @@
     </w:p>
     <w:p>
       <w:pPr>
-        <w:pStyle w:val="TOC2"/>
+        <w:pStyle w:val="Mucluc2"/>
         <w:tabs>
           <w:tab w:val="right" w:leader="dot" w:pos="9019"/>
         </w:tabs>
@@ -1231,7 +1231,7 @@
       <w:hyperlink w:anchor="_Toc234651164" w:history="1">
         <w:r>
           <w:rPr>
-            <w:rStyle w:val="Hyperlink"/>
+            <w:rStyle w:val="Siuktni"/>
             <w:noProof/>
           </w:rPr>
           <w:t>1.2. Phạm vi hệ thống</w:t>
@@ -1288,7 +1288,7 @@
     </w:p>
     <w:p>
       <w:pPr>
-        <w:pStyle w:val="TOC2"/>
+        <w:pStyle w:val="Mucluc2"/>
         <w:tabs>
           <w:tab w:val="right" w:leader="dot" w:pos="9019"/>
         </w:tabs>
@@ -1301,7 +1301,7 @@
       <w:hyperlink w:anchor="_Toc234651165" w:history="1">
         <w:r>
           <w:rPr>
-            <w:rStyle w:val="Hyperlink"/>
+            <w:rStyle w:val="Siuktni"/>
             <w:noProof/>
           </w:rPr>
           <w:t>1.3. Ngoài phạm vi đồ án (hướng phát triển)</w:t>
@@ -1358,7 +1358,7 @@
     </w:p>
     <w:p>
       <w:pPr>
-        <w:pStyle w:val="TOC2"/>
+        <w:pStyle w:val="Mucluc2"/>
         <w:tabs>
           <w:tab w:val="right" w:leader="dot" w:pos="9019"/>
         </w:tabs>
@@ -1371,7 +1371,7 @@
       <w:hyperlink w:anchor="_Toc234651166" w:history="1">
         <w:r>
           <w:rPr>
-            <w:rStyle w:val="Hyperlink"/>
+            <w:rStyle w:val="Siuktni"/>
             <w:noProof/>
           </w:rPr>
           <w:t>1.4. Actor của hệ thống</w:t>
@@ -1428,7 +1428,7 @@
     </w:p>
     <w:p>
       <w:pPr>
-        <w:pStyle w:val="TOC2"/>
+        <w:pStyle w:val="Mucluc2"/>
         <w:tabs>
           <w:tab w:val="right" w:leader="dot" w:pos="9019"/>
         </w:tabs>
@@ -1441,7 +1441,7 @@
       <w:hyperlink w:anchor="_Toc234651167" w:history="1">
         <w:r>
           <w:rPr>
-            <w:rStyle w:val="Hyperlink"/>
+            <w:rStyle w:val="Siuktni"/>
             <w:noProof/>
           </w:rPr>
           <w:t>1.5. Yêu cầu chức năng</w:t>
@@ -1498,7 +1498,7 @@
     </w:p>
     <w:p>
       <w:pPr>
-        <w:pStyle w:val="TOC3"/>
+        <w:pStyle w:val="Mucluc3"/>
         <w:tabs>
           <w:tab w:val="right" w:leader="dot" w:pos="9019"/>
         </w:tabs>
@@ -1511,7 +1511,7 @@
       <w:hyperlink w:anchor="_Toc234651168" w:history="1">
         <w:r>
           <w:rPr>
-            <w:rStyle w:val="Hyperlink"/>
+            <w:rStyle w:val="Siuktni"/>
             <w:noProof/>
           </w:rPr>
           <w:t>1.5.1. Nhóm Guest</w:t>
@@ -1568,7 +1568,7 @@
     </w:p>
     <w:p>
       <w:pPr>
-        <w:pStyle w:val="TOC3"/>
+        <w:pStyle w:val="Mucluc3"/>
         <w:tabs>
           <w:tab w:val="right" w:leader="dot" w:pos="9019"/>
         </w:tabs>
@@ -1581,7 +1581,7 @@
       <w:hyperlink w:anchor="_Toc234651169" w:history="1">
         <w:r>
           <w:rPr>
-            <w:rStyle w:val="Hyperlink"/>
+            <w:rStyle w:val="Siuktni"/>
             <w:noProof/>
           </w:rPr>
           <w:t>1.5.2. Nhóm User</w:t>
@@ -1638,7 +1638,7 @@
     </w:p>
     <w:p>
       <w:pPr>
-        <w:pStyle w:val="TOC3"/>
+        <w:pStyle w:val="Mucluc3"/>
         <w:tabs>
           <w:tab w:val="right" w:leader="dot" w:pos="9019"/>
         </w:tabs>
@@ -1651,7 +1651,7 @@
       <w:hyperlink w:anchor="_Toc234651170" w:history="1">
         <w:r>
           <w:rPr>
-            <w:rStyle w:val="Hyperlink"/>
+            <w:rStyle w:val="Siuktni"/>
             <w:noProof/>
           </w:rPr>
           <w:t>1.5.3. Nhóm Admin</w:t>
@@ -1708,7 +1708,7 @@
     </w:p>
     <w:p>
       <w:pPr>
-        <w:pStyle w:val="TOC2"/>
+        <w:pStyle w:val="Mucluc2"/>
         <w:tabs>
           <w:tab w:val="right" w:leader="dot" w:pos="9019"/>
         </w:tabs>
@@ -1721,7 +1721,7 @@
       <w:hyperlink w:anchor="_Toc234651171" w:history="1">
         <w:r>
           <w:rPr>
-            <w:rStyle w:val="Hyperlink"/>
+            <w:rStyle w:val="Siuktni"/>
             <w:noProof/>
           </w:rPr>
           <w:t>1.6. Yêu cầu phi chức năng</w:t>
@@ -1778,7 +1778,7 @@
     </w:p>
     <w:p>
       <w:pPr>
-        <w:pStyle w:val="TOC2"/>
+        <w:pStyle w:val="Mucluc2"/>
         <w:tabs>
           <w:tab w:val="right" w:leader="dot" w:pos="9019"/>
         </w:tabs>
@@ -1791,7 +1791,7 @@
       <w:hyperlink w:anchor="_Toc234651172" w:history="1">
         <w:r>
           <w:rPr>
-            <w:rStyle w:val="Hyperlink"/>
+            <w:rStyle w:val="Siuktni"/>
             <w:noProof/>
           </w:rPr>
           <w:t>1.7. Ràng buộc kỹ thuật</w:t>
@@ -1848,7 +1848,7 @@
     </w:p>
     <w:p>
       <w:pPr>
-        <w:pStyle w:val="TOC1"/>
+        <w:pStyle w:val="Mucluc1"/>
         <w:tabs>
           <w:tab w:val="right" w:leader="dot" w:pos="9019"/>
         </w:tabs>
@@ -1861,7 +1861,7 @@
       <w:hyperlink w:anchor="_Toc234651173" w:history="1">
         <w:r>
           <w:rPr>
-            <w:rStyle w:val="Hyperlink"/>
+            <w:rStyle w:val="Siuktni"/>
             <w:noProof/>
           </w:rPr>
           <w:t>2. ĐẶC TẢ USE CASE</w:t>
@@ -1918,7 +1918,7 @@
     </w:p>
     <w:p>
       <w:pPr>
-        <w:pStyle w:val="TOC2"/>
+        <w:pStyle w:val="Mucluc2"/>
         <w:tabs>
           <w:tab w:val="right" w:leader="dot" w:pos="9019"/>
         </w:tabs>
@@ -1931,7 +1931,7 @@
       <w:hyperlink w:anchor="_Toc234651174" w:history="1">
         <w:r>
           <w:rPr>
-            <w:rStyle w:val="Hyperlink"/>
+            <w:rStyle w:val="Siuktni"/>
             <w:noProof/>
           </w:rPr>
           <w:t>2.1. Sơ đồ Use Case tổng quát</w:t>
@@ -1988,7 +1988,7 @@
     </w:p>
     <w:p>
       <w:pPr>
-        <w:pStyle w:val="TOC2"/>
+        <w:pStyle w:val="Mucluc2"/>
         <w:tabs>
           <w:tab w:val="right" w:leader="dot" w:pos="9019"/>
         </w:tabs>
@@ -2001,7 +2001,7 @@
       <w:hyperlink w:anchor="_Toc234651175" w:history="1">
         <w:r>
           <w:rPr>
-            <w:rStyle w:val="Hyperlink"/>
+            <w:rStyle w:val="Siuktni"/>
             <w:noProof/>
           </w:rPr>
           <w:t>2.2. Danh sách Use Case chính</w:t>
@@ -2058,7 +2058,7 @@
     </w:p>
     <w:p>
       <w:pPr>
-        <w:pStyle w:val="TOC2"/>
+        <w:pStyle w:val="Mucluc2"/>
         <w:tabs>
           <w:tab w:val="right" w:leader="dot" w:pos="9019"/>
         </w:tabs>
@@ -2071,7 +2071,7 @@
       <w:hyperlink w:anchor="_Toc234651176" w:history="1">
         <w:r>
           <w:rPr>
-            <w:rStyle w:val="Hyperlink"/>
+            <w:rStyle w:val="Siuktni"/>
             <w:noProof/>
           </w:rPr>
           <w:t>2.3. Đặc tả chi tiết các use case</w:t>
@@ -2128,7 +2128,7 @@
     </w:p>
     <w:p>
       <w:pPr>
-        <w:pStyle w:val="TOC3"/>
+        <w:pStyle w:val="Mucluc3"/>
         <w:tabs>
           <w:tab w:val="right" w:leader="dot" w:pos="9019"/>
         </w:tabs>
@@ -2141,7 +2141,7 @@
       <w:hyperlink w:anchor="_Toc234651177" w:history="1">
         <w:r>
           <w:rPr>
-            <w:rStyle w:val="Hyperlink"/>
+            <w:rStyle w:val="Siuktni"/>
             <w:noProof/>
           </w:rPr>
           <w:t>2.3.1. UC01 - Khám phá điểm đến</w:t>
@@ -2198,7 +2198,7 @@
     </w:p>
     <w:p>
       <w:pPr>
-        <w:pStyle w:val="TOC3"/>
+        <w:pStyle w:val="Mucluc3"/>
         <w:tabs>
           <w:tab w:val="right" w:leader="dot" w:pos="9019"/>
         </w:tabs>
@@ -2211,7 +2211,7 @@
       <w:hyperlink w:anchor="_Toc234651178" w:history="1">
         <w:r>
           <w:rPr>
-            <w:rStyle w:val="Hyperlink"/>
+            <w:rStyle w:val="Siuktni"/>
             <w:noProof/>
           </w:rPr>
           <w:t>2.3.2. UC02 - Tìm địa danh</w:t>
@@ -2268,7 +2268,7 @@
     </w:p>
     <w:p>
       <w:pPr>
-        <w:pStyle w:val="TOC3"/>
+        <w:pStyle w:val="Mucluc3"/>
         <w:tabs>
           <w:tab w:val="right" w:leader="dot" w:pos="9019"/>
         </w:tabs>
@@ -2281,7 +2281,7 @@
       <w:hyperlink w:anchor="_Toc234651179" w:history="1">
         <w:r>
           <w:rPr>
-            <w:rStyle w:val="Hyperlink"/>
+            <w:rStyle w:val="Siuktni"/>
             <w:noProof/>
           </w:rPr>
           <w:t>2.3.3. UC03 - Xem POI xung quanh</w:t>
@@ -2338,7 +2338,7 @@
     </w:p>
     <w:p>
       <w:pPr>
-        <w:pStyle w:val="TOC3"/>
+        <w:pStyle w:val="Mucluc3"/>
         <w:tabs>
           <w:tab w:val="right" w:leader="dot" w:pos="9019"/>
         </w:tabs>
@@ -2351,7 +2351,7 @@
       <w:hyperlink w:anchor="_Toc234651180" w:history="1">
         <w:r>
           <w:rPr>
-            <w:rStyle w:val="Hyperlink"/>
+            <w:rStyle w:val="Siuktni"/>
             <w:noProof/>
           </w:rPr>
           <w:t>2.3.4. UC04 - Xem thời tiết</w:t>
@@ -2408,7 +2408,7 @@
     </w:p>
     <w:p>
       <w:pPr>
-        <w:pStyle w:val="TOC3"/>
+        <w:pStyle w:val="Mucluc3"/>
         <w:tabs>
           <w:tab w:val="right" w:leader="dot" w:pos="9019"/>
         </w:tabs>
@@ -2421,7 +2421,7 @@
       <w:hyperlink w:anchor="_Toc234651181" w:history="1">
         <w:r>
           <w:rPr>
-            <w:rStyle w:val="Hyperlink"/>
+            <w:rStyle w:val="Siuktni"/>
             <w:noProof/>
           </w:rPr>
           <w:t>2.3.5. UC05 - Tìm kiếm khách sạn</w:t>
@@ -2478,7 +2478,7 @@
     </w:p>
     <w:p>
       <w:pPr>
-        <w:pStyle w:val="TOC3"/>
+        <w:pStyle w:val="Mucluc3"/>
         <w:tabs>
           <w:tab w:val="right" w:leader="dot" w:pos="9019"/>
         </w:tabs>
@@ -2491,7 +2491,7 @@
       <w:hyperlink w:anchor="_Toc234651182" w:history="1">
         <w:r>
           <w:rPr>
-            <w:rStyle w:val="Hyperlink"/>
+            <w:rStyle w:val="Siuktni"/>
             <w:noProof/>
           </w:rPr>
           <w:t>2.3.6. UC06 - Xem chi tiết khách sạn</w:t>
@@ -2548,7 +2548,7 @@
     </w:p>
     <w:p>
       <w:pPr>
-        <w:pStyle w:val="TOC3"/>
+        <w:pStyle w:val="Mucluc3"/>
         <w:tabs>
           <w:tab w:val="right" w:leader="dot" w:pos="9019"/>
         </w:tabs>
@@ -2561,7 +2561,7 @@
       <w:hyperlink w:anchor="_Toc234651183" w:history="1">
         <w:r>
           <w:rPr>
-            <w:rStyle w:val="Hyperlink"/>
+            <w:rStyle w:val="Siuktni"/>
             <w:noProof/>
           </w:rPr>
           <w:t>2.3.7. UC07 - Đăng ký</w:t>
@@ -2618,7 +2618,7 @@
     </w:p>
     <w:p>
       <w:pPr>
-        <w:pStyle w:val="TOC3"/>
+        <w:pStyle w:val="Mucluc3"/>
         <w:tabs>
           <w:tab w:val="right" w:leader="dot" w:pos="9019"/>
         </w:tabs>
@@ -2631,7 +2631,7 @@
       <w:hyperlink w:anchor="_Toc234651184" w:history="1">
         <w:r>
           <w:rPr>
-            <w:rStyle w:val="Hyperlink"/>
+            <w:rStyle w:val="Siuktni"/>
             <w:noProof/>
           </w:rPr>
           <w:t>2.3.8. UC08 - Đăng nhập</w:t>
@@ -2688,7 +2688,7 @@
     </w:p>
     <w:p>
       <w:pPr>
-        <w:pStyle w:val="TOC3"/>
+        <w:pStyle w:val="Mucluc3"/>
         <w:tabs>
           <w:tab w:val="right" w:leader="dot" w:pos="9019"/>
         </w:tabs>
@@ -2701,7 +2701,7 @@
       <w:hyperlink w:anchor="_Toc234651185" w:history="1">
         <w:r>
           <w:rPr>
-            <w:rStyle w:val="Hyperlink"/>
+            <w:rStyle w:val="Siuktni"/>
             <w:noProof/>
           </w:rPr>
           <w:t>2.3.9. UC09 - Đăng xuất</w:t>
@@ -2758,7 +2758,7 @@
     </w:p>
     <w:p>
       <w:pPr>
-        <w:pStyle w:val="TOC3"/>
+        <w:pStyle w:val="Mucluc3"/>
         <w:tabs>
           <w:tab w:val="right" w:leader="dot" w:pos="9019"/>
         </w:tabs>
@@ -2771,7 +2771,7 @@
       <w:hyperlink w:anchor="_Toc234651186" w:history="1">
         <w:r>
           <w:rPr>
-            <w:rStyle w:val="Hyperlink"/>
+            <w:rStyle w:val="Siuktni"/>
             <w:noProof/>
           </w:rPr>
           <w:t>2.3.10. UC10 - Quên / đặt lại mật khẩu</w:t>
@@ -2828,7 +2828,7 @@
     </w:p>
     <w:p>
       <w:pPr>
-        <w:pStyle w:val="TOC3"/>
+        <w:pStyle w:val="Mucluc3"/>
         <w:tabs>
           <w:tab w:val="right" w:leader="dot" w:pos="9019"/>
         </w:tabs>
@@ -2841,7 +2841,7 @@
       <w:hyperlink w:anchor="_Toc234651187" w:history="1">
         <w:r>
           <w:rPr>
-            <w:rStyle w:val="Hyperlink"/>
+            <w:rStyle w:val="Siuktni"/>
             <w:noProof/>
           </w:rPr>
           <w:t>2.3.11. UC11 - Quản lý hồ sơ cá nhân</w:t>
@@ -2898,7 +2898,7 @@
     </w:p>
     <w:p>
       <w:pPr>
-        <w:pStyle w:val="TOC3"/>
+        <w:pStyle w:val="Mucluc3"/>
         <w:tabs>
           <w:tab w:val="right" w:leader="dot" w:pos="9019"/>
         </w:tabs>
@@ -2911,7 +2911,7 @@
       <w:hyperlink w:anchor="_Toc234651188" w:history="1">
         <w:r>
           <w:rPr>
-            <w:rStyle w:val="Hyperlink"/>
+            <w:rStyle w:val="Siuktni"/>
             <w:noProof/>
           </w:rPr>
           <w:t>2.3.12. UC12 - Tạo/Sửa/Xóa chuyến đi</w:t>
@@ -2968,7 +2968,7 @@
     </w:p>
     <w:p>
       <w:pPr>
-        <w:pStyle w:val="TOC3"/>
+        <w:pStyle w:val="Mucluc3"/>
         <w:tabs>
           <w:tab w:val="right" w:leader="dot" w:pos="9019"/>
         </w:tabs>
@@ -2981,7 +2981,7 @@
       <w:hyperlink w:anchor="_Toc234651189" w:history="1">
         <w:r>
           <w:rPr>
-            <w:rStyle w:val="Hyperlink"/>
+            <w:rStyle w:val="Siuktni"/>
             <w:noProof/>
           </w:rPr>
           <w:t>2.3.13. UC13 - Lập lịch trình chi tiết</w:t>
@@ -3038,7 +3038,7 @@
     </w:p>
     <w:p>
       <w:pPr>
-        <w:pStyle w:val="TOC3"/>
+        <w:pStyle w:val="Mucluc3"/>
         <w:tabs>
           <w:tab w:val="right" w:leader="dot" w:pos="9019"/>
         </w:tabs>
@@ -3051,7 +3051,7 @@
       <w:hyperlink w:anchor="_Toc234651190" w:history="1">
         <w:r>
           <w:rPr>
-            <w:rStyle w:val="Hyperlink"/>
+            <w:rStyle w:val="Siuktni"/>
             <w:noProof/>
           </w:rPr>
           <w:t>2.3.14. UC14 - Quản lý ngân sách chuyến đi</w:t>
@@ -3108,7 +3108,7 @@
     </w:p>
     <w:p>
       <w:pPr>
-        <w:pStyle w:val="TOC3"/>
+        <w:pStyle w:val="Mucluc3"/>
         <w:tabs>
           <w:tab w:val="right" w:leader="dot" w:pos="9019"/>
         </w:tabs>
@@ -3121,7 +3121,7 @@
       <w:hyperlink w:anchor="_Toc234651191" w:history="1">
         <w:r>
           <w:rPr>
-            <w:rStyle w:val="Hyperlink"/>
+            <w:rStyle w:val="Siuktni"/>
             <w:noProof/>
           </w:rPr>
           <w:t>2.3.15. UC15 - Quản lý checklist chuyến đi</w:t>
@@ -3178,7 +3178,7 @@
     </w:p>
     <w:p>
       <w:pPr>
-        <w:pStyle w:val="TOC3"/>
+        <w:pStyle w:val="Mucluc3"/>
         <w:tabs>
           <w:tab w:val="right" w:leader="dot" w:pos="9019"/>
         </w:tabs>
@@ -3191,7 +3191,7 @@
       <w:hyperlink w:anchor="_Toc234651192" w:history="1">
         <w:r>
           <w:rPr>
-            <w:rStyle w:val="Hyperlink"/>
+            <w:rStyle w:val="Siuktni"/>
             <w:noProof/>
           </w:rPr>
           <w:t>2.3.16. UC16 - Quản lý chỗ ở chuyến đi</w:t>
@@ -3248,7 +3248,7 @@
     </w:p>
     <w:p>
       <w:pPr>
-        <w:pStyle w:val="TOC3"/>
+        <w:pStyle w:val="Mucluc3"/>
         <w:tabs>
           <w:tab w:val="right" w:leader="dot" w:pos="9019"/>
         </w:tabs>
@@ -3261,7 +3261,7 @@
       <w:hyperlink w:anchor="_Toc234651193" w:history="1">
         <w:r>
           <w:rPr>
-            <w:rStyle w:val="Hyperlink"/>
+            <w:rStyle w:val="Siuktni"/>
             <w:noProof/>
           </w:rPr>
           <w:t>2.3.17. UC17 - Quản lý cộng tác viên</w:t>
@@ -3318,7 +3318,7 @@
     </w:p>
     <w:p>
       <w:pPr>
-        <w:pStyle w:val="TOC3"/>
+        <w:pStyle w:val="Mucluc3"/>
         <w:tabs>
           <w:tab w:val="right" w:leader="dot" w:pos="9019"/>
         </w:tabs>
@@ -3331,7 +3331,7 @@
       <w:hyperlink w:anchor="_Toc234651194" w:history="1">
         <w:r>
           <w:rPr>
-            <w:rStyle w:val="Hyperlink"/>
+            <w:rStyle w:val="Siuktni"/>
             <w:noProof/>
           </w:rPr>
           <w:t>2.3.18. UC18 - Chia sẻ chuyến đi công khai</w:t>
@@ -3388,7 +3388,7 @@
     </w:p>
     <w:p>
       <w:pPr>
-        <w:pStyle w:val="TOC3"/>
+        <w:pStyle w:val="Mucluc3"/>
         <w:tabs>
           <w:tab w:val="right" w:leader="dot" w:pos="9019"/>
         </w:tabs>
@@ -3401,7 +3401,7 @@
       <w:hyperlink w:anchor="_Toc234651195" w:history="1">
         <w:r>
           <w:rPr>
-            <w:rStyle w:val="Hyperlink"/>
+            <w:rStyle w:val="Siuktni"/>
             <w:noProof/>
           </w:rPr>
           <w:t>2.3.19. UC19 - Lưu địa điểm yêu thích</w:t>
@@ -3458,7 +3458,7 @@
     </w:p>
     <w:p>
       <w:pPr>
-        <w:pStyle w:val="TOC3"/>
+        <w:pStyle w:val="Mucluc3"/>
         <w:tabs>
           <w:tab w:val="right" w:leader="dot" w:pos="9019"/>
         </w:tabs>
@@ -3471,7 +3471,7 @@
       <w:hyperlink w:anchor="_Toc234651196" w:history="1">
         <w:r>
           <w:rPr>
-            <w:rStyle w:val="Hyperlink"/>
+            <w:rStyle w:val="Siuktni"/>
             <w:noProof/>
           </w:rPr>
           <w:t>2.3.20. UC20 - Xem lịch sử tìm kiếm</w:t>
@@ -3528,7 +3528,7 @@
     </w:p>
     <w:p>
       <w:pPr>
-        <w:pStyle w:val="TOC3"/>
+        <w:pStyle w:val="Mucluc3"/>
         <w:tabs>
           <w:tab w:val="right" w:leader="dot" w:pos="9019"/>
         </w:tabs>
@@ -3541,7 +3541,7 @@
       <w:hyperlink w:anchor="_Toc234651197" w:history="1">
         <w:r>
           <w:rPr>
-            <w:rStyle w:val="Hyperlink"/>
+            <w:rStyle w:val="Siuktni"/>
             <w:noProof/>
           </w:rPr>
           <w:t>2.3.21. UC21 - Nhận gợi ý địa điểm</w:t>
@@ -3598,7 +3598,7 @@
     </w:p>
     <w:p>
       <w:pPr>
-        <w:pStyle w:val="TOC3"/>
+        <w:pStyle w:val="Mucluc3"/>
         <w:tabs>
           <w:tab w:val="right" w:leader="dot" w:pos="9019"/>
         </w:tabs>
@@ -3611,7 +3611,7 @@
       <w:hyperlink w:anchor="_Toc234651198" w:history="1">
         <w:r>
           <w:rPr>
-            <w:rStyle w:val="Hyperlink"/>
+            <w:rStyle w:val="Siuktni"/>
             <w:noProof/>
           </w:rPr>
           <w:t>2.3.22. UC22 - Đánh giá địa điểm / khách sạn</w:t>
@@ -3668,7 +3668,7 @@
     </w:p>
     <w:p>
       <w:pPr>
-        <w:pStyle w:val="TOC3"/>
+        <w:pStyle w:val="Mucluc3"/>
         <w:tabs>
           <w:tab w:val="right" w:leader="dot" w:pos="9019"/>
         </w:tabs>
@@ -3681,7 +3681,7 @@
       <w:hyperlink w:anchor="_Toc234651199" w:history="1">
         <w:r>
           <w:rPr>
-            <w:rStyle w:val="Hyperlink"/>
+            <w:rStyle w:val="Siuktni"/>
             <w:noProof/>
           </w:rPr>
           <w:t>2.3.23. UC23 - Báo cáo đánh giá vi phạm</w:t>
@@ -3738,7 +3738,7 @@
     </w:p>
     <w:p>
       <w:pPr>
-        <w:pStyle w:val="TOC3"/>
+        <w:pStyle w:val="Mucluc3"/>
         <w:tabs>
           <w:tab w:val="right" w:leader="dot" w:pos="9019"/>
         </w:tabs>
@@ -3751,7 +3751,7 @@
       <w:hyperlink w:anchor="_Toc234651200" w:history="1">
         <w:r>
           <w:rPr>
-            <w:rStyle w:val="Hyperlink"/>
+            <w:rStyle w:val="Siuktni"/>
             <w:noProof/>
           </w:rPr>
           <w:t>2.3.24. UC24 - Nhận cảnh báo thời tiết tự động</w:t>
@@ -3808,7 +3808,7 @@
     </w:p>
     <w:p>
       <w:pPr>
-        <w:pStyle w:val="TOC3"/>
+        <w:pStyle w:val="Mucluc3"/>
         <w:tabs>
           <w:tab w:val="right" w:leader="dot" w:pos="9019"/>
         </w:tabs>
@@ -3821,7 +3821,7 @@
       <w:hyperlink w:anchor="_Toc234651201" w:history="1">
         <w:r>
           <w:rPr>
-            <w:rStyle w:val="Hyperlink"/>
+            <w:rStyle w:val="Siuktni"/>
             <w:noProof/>
           </w:rPr>
           <w:t>2.3.25. UC25 - Quản lý người dùng</w:t>
@@ -3878,7 +3878,7 @@
     </w:p>
     <w:p>
       <w:pPr>
-        <w:pStyle w:val="TOC3"/>
+        <w:pStyle w:val="Mucluc3"/>
         <w:tabs>
           <w:tab w:val="right" w:leader="dot" w:pos="9019"/>
         </w:tabs>
@@ -3891,7 +3891,7 @@
       <w:hyperlink w:anchor="_Toc234651202" w:history="1">
         <w:r>
           <w:rPr>
-            <w:rStyle w:val="Hyperlink"/>
+            <w:rStyle w:val="Siuktni"/>
             <w:noProof/>
           </w:rPr>
           <w:t>2.3.26. UC26 - Xem thống kê hệ thống</w:t>
@@ -3948,7 +3948,7 @@
     </w:p>
     <w:p>
       <w:pPr>
-        <w:pStyle w:val="TOC3"/>
+        <w:pStyle w:val="Mucluc3"/>
         <w:tabs>
           <w:tab w:val="right" w:leader="dot" w:pos="9019"/>
         </w:tabs>
@@ -3961,7 +3961,7 @@
       <w:hyperlink w:anchor="_Toc234651203" w:history="1">
         <w:r>
           <w:rPr>
-            <w:rStyle w:val="Hyperlink"/>
+            <w:rStyle w:val="Siuktni"/>
             <w:noProof/>
           </w:rPr>
           <w:t>2.3.27. UC27 - Xem audit log</w:t>
@@ -4018,7 +4018,7 @@
     </w:p>
     <w:p>
       <w:pPr>
-        <w:pStyle w:val="TOC3"/>
+        <w:pStyle w:val="Mucluc3"/>
         <w:tabs>
           <w:tab w:val="right" w:leader="dot" w:pos="9019"/>
         </w:tabs>
@@ -4031,7 +4031,7 @@
       <w:hyperlink w:anchor="_Toc234651204" w:history="1">
         <w:r>
           <w:rPr>
-            <w:rStyle w:val="Hyperlink"/>
+            <w:rStyle w:val="Siuktni"/>
             <w:noProof/>
           </w:rPr>
           <w:t>2.3.28. UC28 - Xử lý report đánh giá</w:t>
@@ -4088,7 +4088,7 @@
     </w:p>
     <w:p>
       <w:pPr>
-        <w:pStyle w:val="TOC1"/>
+        <w:pStyle w:val="Mucluc1"/>
         <w:tabs>
           <w:tab w:val="right" w:leader="dot" w:pos="9019"/>
         </w:tabs>
@@ -4101,7 +4101,7 @@
       <w:hyperlink w:anchor="_Toc234651205" w:history="1">
         <w:r>
           <w:rPr>
-            <w:rStyle w:val="Hyperlink"/>
+            <w:rStyle w:val="Siuktni"/>
             <w:noProof/>
           </w:rPr>
           <w:t>3. THIẾT KẾ DỮ LIỆU MONGODB VÀ REDIS</w:t>
@@ -4158,7 +4158,7 @@
     </w:p>
     <w:p>
       <w:pPr>
-        <w:pStyle w:val="TOC2"/>
+        <w:pStyle w:val="Mucluc2"/>
         <w:tabs>
           <w:tab w:val="right" w:leader="dot" w:pos="9019"/>
         </w:tabs>
@@ -4171,7 +4171,7 @@
       <w:hyperlink w:anchor="_Toc234651206" w:history="1">
         <w:r>
           <w:rPr>
-            <w:rStyle w:val="Hyperlink"/>
+            <w:rStyle w:val="Siuktni"/>
             <w:noProof/>
           </w:rPr>
           <w:t>3.1. Định hướng thiết kế dữ liệu</w:t>
@@ -4228,7 +4228,7 @@
     </w:p>
     <w:p>
       <w:pPr>
-        <w:pStyle w:val="TOC2"/>
+        <w:pStyle w:val="Mucluc2"/>
         <w:tabs>
           <w:tab w:val="right" w:leader="dot" w:pos="9019"/>
         </w:tabs>
@@ -4241,7 +4241,7 @@
       <w:hyperlink w:anchor="_Toc234651207" w:history="1">
         <w:r>
           <w:rPr>
-            <w:rStyle w:val="Hyperlink"/>
+            <w:rStyle w:val="Siuktni"/>
             <w:noProof/>
           </w:rPr>
           <w:t>3.2. Các collection chính</w:t>
@@ -4298,7 +4298,7 @@
     </w:p>
     <w:p>
       <w:pPr>
-        <w:pStyle w:val="TOC2"/>
+        <w:pStyle w:val="Mucluc2"/>
         <w:tabs>
           <w:tab w:val="right" w:leader="dot" w:pos="9019"/>
         </w:tabs>
@@ -4311,7 +4311,7 @@
       <w:hyperlink w:anchor="_Toc234651208" w:history="1">
         <w:r>
           <w:rPr>
-            <w:rStyle w:val="Hyperlink"/>
+            <w:rStyle w:val="Siuktni"/>
             <w:noProof/>
           </w:rPr>
           <w:t>3.3. Chỉ mục MongoDB</w:t>
@@ -4368,7 +4368,7 @@
     </w:p>
     <w:p>
       <w:pPr>
-        <w:pStyle w:val="TOC2"/>
+        <w:pStyle w:val="Mucluc2"/>
         <w:tabs>
           <w:tab w:val="right" w:leader="dot" w:pos="9019"/>
         </w:tabs>
@@ -4381,7 +4381,7 @@
       <w:hyperlink w:anchor="_Toc234651209" w:history="1">
         <w:r>
           <w:rPr>
-            <w:rStyle w:val="Hyperlink"/>
+            <w:rStyle w:val="Siuktni"/>
             <w:noProof/>
           </w:rPr>
           <w:t>3.4. Kiến trúc Redis</w:t>
@@ -4438,7 +4438,7 @@
     </w:p>
     <w:p>
       <w:pPr>
-        <w:pStyle w:val="TOC2"/>
+        <w:pStyle w:val="Mucluc2"/>
         <w:tabs>
           <w:tab w:val="right" w:leader="dot" w:pos="9019"/>
         </w:tabs>
@@ -4451,7 +4451,7 @@
       <w:hyperlink w:anchor="_Toc234651210" w:history="1">
         <w:r>
           <w:rPr>
-            <w:rStyle w:val="Hyperlink"/>
+            <w:rStyle w:val="Siuktni"/>
             <w:noProof/>
           </w:rPr>
           <w:t>3.5. Schema TypeScript tham khảo</w:t>
@@ -4508,7 +4508,7 @@
     </w:p>
     <w:p>
       <w:pPr>
-        <w:pStyle w:val="TOC1"/>
+        <w:pStyle w:val="Mucluc1"/>
         <w:tabs>
           <w:tab w:val="right" w:leader="dot" w:pos="9019"/>
         </w:tabs>
@@ -4521,7 +4521,7 @@
       <w:hyperlink w:anchor="_Toc234651211" w:history="1">
         <w:r>
           <w:rPr>
-            <w:rStyle w:val="Hyperlink"/>
+            <w:rStyle w:val="Siuktni"/>
             <w:noProof/>
           </w:rPr>
           <w:t>4. SƠ ĐỒ TUẦN TỰ CÁC LUỒNG XỬ LÝ CHÍNH</w:t>
@@ -4578,7 +4578,7 @@
     </w:p>
     <w:p>
       <w:pPr>
-        <w:pStyle w:val="TOC2"/>
+        <w:pStyle w:val="Mucluc2"/>
         <w:tabs>
           <w:tab w:val="right" w:leader="dot" w:pos="9019"/>
         </w:tabs>
@@ -4591,7 +4591,7 @@
       <w:hyperlink w:anchor="_Toc234651212" w:history="1">
         <w:r>
           <w:rPr>
-            <w:rStyle w:val="Hyperlink"/>
+            <w:rStyle w:val="Siuktni"/>
             <w:noProof/>
           </w:rPr>
           <w:t>4.1. Luồng tìm kiếm địa danh có cache</w:t>
@@ -4648,7 +4648,7 @@
     </w:p>
     <w:p>
       <w:pPr>
-        <w:pStyle w:val="TOC2"/>
+        <w:pStyle w:val="Mucluc2"/>
         <w:tabs>
           <w:tab w:val="right" w:leader="dot" w:pos="9019"/>
         </w:tabs>
@@ -4661,7 +4661,7 @@
       <w:hyperlink w:anchor="_Toc234651213" w:history="1">
         <w:r>
           <w:rPr>
-            <w:rStyle w:val="Hyperlink"/>
+            <w:rStyle w:val="Siuktni"/>
             <w:noProof/>
           </w:rPr>
           <w:t>4.2. Luồng đăng nhập có rate limit</w:t>
@@ -4718,7 +4718,7 @@
     </w:p>
     <w:p>
       <w:pPr>
-        <w:pStyle w:val="TOC2"/>
+        <w:pStyle w:val="Mucluc2"/>
         <w:tabs>
           <w:tab w:val="right" w:leader="dot" w:pos="9019"/>
         </w:tabs>
@@ -4731,7 +4731,7 @@
       <w:hyperlink w:anchor="_Toc234651214" w:history="1">
         <w:r>
           <w:rPr>
-            <w:rStyle w:val="Hyperlink"/>
+            <w:rStyle w:val="Siuktni"/>
             <w:noProof/>
           </w:rPr>
           <w:t>4.3. Luồng tạo chuyến đi có audit log</w:t>
@@ -4788,7 +4788,7 @@
     </w:p>
     <w:p>
       <w:pPr>
-        <w:pStyle w:val="TOC2"/>
+        <w:pStyle w:val="Mucluc2"/>
         <w:tabs>
           <w:tab w:val="right" w:leader="dot" w:pos="9019"/>
         </w:tabs>
@@ -4801,7 +4801,7 @@
       <w:hyperlink w:anchor="_Toc234651215" w:history="1">
         <w:r>
           <w:rPr>
-            <w:rStyle w:val="Hyperlink"/>
+            <w:rStyle w:val="Siuktni"/>
             <w:noProof/>
           </w:rPr>
           <w:t>4.4. Luồng sắp xếp lại lịch trình (2 pha)</w:t>
@@ -4858,7 +4858,7 @@
     </w:p>
     <w:p>
       <w:pPr>
-        <w:pStyle w:val="TOC2"/>
+        <w:pStyle w:val="Mucluc2"/>
         <w:tabs>
           <w:tab w:val="right" w:leader="dot" w:pos="9019"/>
         </w:tabs>
@@ -4871,7 +4871,7 @@
       <w:hyperlink w:anchor="_Toc234651216" w:history="1">
         <w:r>
           <w:rPr>
-            <w:rStyle w:val="Hyperlink"/>
+            <w:rStyle w:val="Siuktni"/>
             <w:noProof/>
           </w:rPr>
           <w:t>4.5. Luồng cảnh báo thời tiết tự động (cron)</w:t>
@@ -4928,7 +4928,7 @@
     </w:p>
     <w:p>
       <w:pPr>
-        <w:pStyle w:val="TOC1"/>
+        <w:pStyle w:val="Mucluc1"/>
         <w:tabs>
           <w:tab w:val="right" w:leader="dot" w:pos="9019"/>
         </w:tabs>
@@ -4941,7 +4941,7 @@
       <w:hyperlink w:anchor="_Toc234651217" w:history="1">
         <w:r>
           <w:rPr>
-            <w:rStyle w:val="Hyperlink"/>
+            <w:rStyle w:val="Siuktni"/>
             <w:noProof/>
           </w:rPr>
           <w:t>5. CẤU TRÚC VÀ SCAFFOLD MÃ NGUỒN</w:t>
@@ -4998,7 +4998,7 @@
     </w:p>
     <w:p>
       <w:pPr>
-        <w:pStyle w:val="TOC2"/>
+        <w:pStyle w:val="Mucluc2"/>
         <w:tabs>
           <w:tab w:val="right" w:leader="dot" w:pos="9019"/>
         </w:tabs>
@@ -5011,7 +5011,7 @@
       <w:hyperlink w:anchor="_Toc234651218" w:history="1">
         <w:r>
           <w:rPr>
-            <w:rStyle w:val="Hyperlink"/>
+            <w:rStyle w:val="Siuktni"/>
             <w:noProof/>
           </w:rPr>
           <w:t>5.1. Công nghệ sử dụng</w:t>
@@ -5068,7 +5068,7 @@
     </w:p>
     <w:p>
       <w:pPr>
-        <w:pStyle w:val="TOC2"/>
+        <w:pStyle w:val="Mucluc2"/>
         <w:tabs>
           <w:tab w:val="right" w:leader="dot" w:pos="9019"/>
         </w:tabs>
@@ -5081,7 +5081,7 @@
       <w:hyperlink w:anchor="_Toc234651219" w:history="1">
         <w:r>
           <w:rPr>
-            <w:rStyle w:val="Hyperlink"/>
+            <w:rStyle w:val="Siuktni"/>
             <w:noProof/>
           </w:rPr>
           <w:t>5.2. Cấu trúc thư mục thực tế</w:t>
@@ -5138,7 +5138,7 @@
     </w:p>
     <w:p>
       <w:pPr>
-        <w:pStyle w:val="TOC2"/>
+        <w:pStyle w:val="Mucluc2"/>
         <w:tabs>
           <w:tab w:val="right" w:leader="dot" w:pos="9019"/>
         </w:tabs>
@@ -5151,7 +5151,7 @@
       <w:hyperlink w:anchor="_Toc234651220" w:history="1">
         <w:r>
           <w:rPr>
-            <w:rStyle w:val="Hyperlink"/>
+            <w:rStyle w:val="Siuktni"/>
             <w:noProof/>
           </w:rPr>
           <w:t>5.3. Biến môi trường thực tế</w:t>
@@ -5208,7 +5208,7 @@
     </w:p>
     <w:p>
       <w:pPr>
-        <w:pStyle w:val="TOC2"/>
+        <w:pStyle w:val="Mucluc2"/>
         <w:tabs>
           <w:tab w:val="right" w:leader="dot" w:pos="9019"/>
         </w:tabs>
@@ -5221,7 +5221,7 @@
       <w:hyperlink w:anchor="_Toc234651221" w:history="1">
         <w:r>
           <w:rPr>
-            <w:rStyle w:val="Hyperlink"/>
+            <w:rStyle w:val="Siuktni"/>
             <w:noProof/>
           </w:rPr>
           <w:t>5.4. Docker Compose local</w:t>
@@ -5278,7 +5278,7 @@
     </w:p>
     <w:p>
       <w:pPr>
-        <w:pStyle w:val="TOC2"/>
+        <w:pStyle w:val="Mucluc2"/>
         <w:tabs>
           <w:tab w:val="right" w:leader="dot" w:pos="9019"/>
         </w:tabs>
@@ -5291,7 +5291,7 @@
       <w:hyperlink w:anchor="_Toc234651222" w:history="1">
         <w:r>
           <w:rPr>
-            <w:rStyle w:val="Hyperlink"/>
+            <w:rStyle w:val="Siuktni"/>
             <w:noProof/>
           </w:rPr>
           <w:t>5.5. Tầng dữ liệu và script vận hành</w:t>
@@ -5348,7 +5348,7 @@
     </w:p>
     <w:p>
       <w:pPr>
-        <w:pStyle w:val="TOC1"/>
+        <w:pStyle w:val="Mucluc1"/>
         <w:tabs>
           <w:tab w:val="right" w:leader="dot" w:pos="9019"/>
         </w:tabs>
@@ -5361,7 +5361,7 @@
       <w:hyperlink w:anchor="_Toc234651223" w:history="1">
         <w:r>
           <w:rPr>
-            <w:rStyle w:val="Hyperlink"/>
+            <w:rStyle w:val="Siuktni"/>
             <w:noProof/>
           </w:rPr>
           <w:t>6. KIỂM THỬ VÀ CHẤT LƯỢNG</w:t>
@@ -5418,7 +5418,7 @@
     </w:p>
     <w:p>
       <w:pPr>
-        <w:pStyle w:val="TOC2"/>
+        <w:pStyle w:val="Mucluc2"/>
         <w:tabs>
           <w:tab w:val="right" w:leader="dot" w:pos="9019"/>
         </w:tabs>
@@ -5431,7 +5431,7 @@
       <w:hyperlink w:anchor="_Toc234651224" w:history="1">
         <w:r>
           <w:rPr>
-            <w:rStyle w:val="Hyperlink"/>
+            <w:rStyle w:val="Siuktni"/>
             <w:noProof/>
           </w:rPr>
           <w:t>6.1. Chiến lược kiểm thử</w:t>
@@ -5488,7 +5488,7 @@
     </w:p>
     <w:p>
       <w:pPr>
-        <w:pStyle w:val="TOC2"/>
+        <w:pStyle w:val="Mucluc2"/>
         <w:tabs>
           <w:tab w:val="right" w:leader="dot" w:pos="9019"/>
         </w:tabs>
@@ -5501,7 +5501,7 @@
       <w:hyperlink w:anchor="_Toc234651225" w:history="1">
         <w:r>
           <w:rPr>
-            <w:rStyle w:val="Hyperlink"/>
+            <w:rStyle w:val="Siuktni"/>
             <w:noProof/>
           </w:rPr>
           <w:t>6.2. Kết quả kiểm thử</w:t>
@@ -5558,7 +5558,7 @@
     </w:p>
     <w:p>
       <w:pPr>
-        <w:pStyle w:val="TOC2"/>
+        <w:pStyle w:val="Mucluc2"/>
         <w:tabs>
           <w:tab w:val="right" w:leader="dot" w:pos="9019"/>
         </w:tabs>
@@ -5571,7 +5571,7 @@
       <w:hyperlink w:anchor="_Toc234651226" w:history="1">
         <w:r>
           <w:rPr>
-            <w:rStyle w:val="Hyperlink"/>
+            <w:rStyle w:val="Siuktni"/>
             <w:noProof/>
           </w:rPr>
           <w:t>6.3. Bảo mật đã rà soát</w:t>
@@ -5628,7 +5628,7 @@
     </w:p>
     <w:p>
       <w:pPr>
-        <w:pStyle w:val="TOC1"/>
+        <w:pStyle w:val="Mucluc1"/>
         <w:tabs>
           <w:tab w:val="right" w:leader="dot" w:pos="9019"/>
         </w:tabs>
@@ -5641,7 +5641,7 @@
       <w:hyperlink w:anchor="_Toc234651227" w:history="1">
         <w:r>
           <w:rPr>
-            <w:rStyle w:val="Hyperlink"/>
+            <w:rStyle w:val="Siuktni"/>
             <w:noProof/>
           </w:rPr>
           <w:t>7. TIÊU CHÍ HOÀN THÀNH VÀ KẾT LUẬN</w:t>
@@ -5698,7 +5698,7 @@
     </w:p>
     <w:p>
       <w:pPr>
-        <w:pStyle w:val="TOC2"/>
+        <w:pStyle w:val="Mucluc2"/>
         <w:tabs>
           <w:tab w:val="right" w:leader="dot" w:pos="9019"/>
         </w:tabs>
@@ -5711,7 +5711,7 @@
       <w:hyperlink w:anchor="_Toc234651228" w:history="1">
         <w:r>
           <w:rPr>
-            <w:rStyle w:val="Hyperlink"/>
+            <w:rStyle w:val="Siuktni"/>
             <w:noProof/>
           </w:rPr>
           <w:t>7.1. Tiêu chí hoàn thành</w:t>
@@ -5768,7 +5768,7 @@
     </w:p>
     <w:p>
       <w:pPr>
-        <w:pStyle w:val="TOC2"/>
+        <w:pStyle w:val="Mucluc2"/>
         <w:tabs>
           <w:tab w:val="right" w:leader="dot" w:pos="9019"/>
         </w:tabs>
@@ -5781,14 +5781,14 @@
       <w:hyperlink w:anchor="_Toc234651229" w:history="1">
         <w:r>
           <w:rPr>
-            <w:rStyle w:val="Hyperlink"/>
+            <w:rStyle w:val="Siuktni"/>
             <w:noProof/>
           </w:rPr>
           <w:t xml:space="preserve">7.2. </w:t>
         </w:r>
         <w:r>
           <w:rPr>
-            <w:rStyle w:val="Hyperlink"/>
+            <w:rStyle w:val="Siuktni"/>
             <w:noProof/>
             <w:lang w:val="en-US"/>
           </w:rPr>
@@ -5796,7 +5796,7 @@
         </w:r>
         <w:r>
           <w:rPr>
-            <w:rStyle w:val="Hyperlink"/>
+            <w:rStyle w:val="Siuktni"/>
             <w:noProof/>
           </w:rPr>
           <w:t>ướng phát triển</w:t>
@@ -5853,7 +5853,7 @@
     </w:p>
     <w:p>
       <w:pPr>
-        <w:pStyle w:val="TOC2"/>
+        <w:pStyle w:val="Mucluc2"/>
         <w:tabs>
           <w:tab w:val="right" w:leader="dot" w:pos="9019"/>
         </w:tabs>
@@ -5866,7 +5866,7 @@
       <w:hyperlink w:anchor="_Toc234651230" w:history="1">
         <w:r>
           <w:rPr>
-            <w:rStyle w:val="Hyperlink"/>
+            <w:rStyle w:val="Siuktni"/>
             <w:noProof/>
           </w:rPr>
           <w:t>7.3. Kết luận</w:t>
@@ -5928,7 +5928,7 @@
     </w:p>
     <w:p>
       <w:pPr>
-        <w:pStyle w:val="Heading1"/>
+        <w:pStyle w:val="u1"/>
         <w:pageBreakBefore/>
       </w:pPr>
       <w:bookmarkStart w:id="1" w:name="_Toc92001"/>
@@ -5954,7 +5954,7 @@
     </w:p>
     <w:tbl>
       <w:tblPr>
-        <w:tblStyle w:val="TableGrid"/>
+        <w:tblStyle w:val="LiBang"/>
         <w:tblW w:w="0" w:type="auto"/>
         <w:tblLook w:val="04A0" w:firstRow="1" w:lastRow="0" w:firstColumn="1" w:lastColumn="0" w:noHBand="0" w:noVBand="1"/>
       </w:tblPr>
@@ -6767,7 +6767,7 @@
     <w:p/>
     <w:p>
       <w:pPr>
-        <w:pStyle w:val="Heading1"/>
+        <w:pStyle w:val="u1"/>
         <w:pageBreakBefore/>
       </w:pPr>
       <w:bookmarkStart w:id="3" w:name="_Toc234651161"/>
@@ -6779,7 +6779,7 @@
     </w:p>
     <w:p>
       <w:pPr>
-        <w:pStyle w:val="TOC1"/>
+        <w:pStyle w:val="Mucluc1"/>
         <w:tabs>
           <w:tab w:val="right" w:leader="dot" w:pos="9019"/>
         </w:tabs>
@@ -6801,7 +6801,7 @@
       <w:hyperlink w:anchor="_Toc234651231" w:history="1">
         <w:r>
           <w:rPr>
-            <w:rStyle w:val="Hyperlink"/>
+            <w:rStyle w:val="Siuktni"/>
             <w:noProof/>
           </w:rPr>
           <w:t>Hình 2.1. Sơ đồ use case tổng quát của hệ thống</w:t>
@@ -6858,7 +6858,7 @@
     </w:p>
     <w:p>
       <w:pPr>
-        <w:pStyle w:val="TOC1"/>
+        <w:pStyle w:val="Mucluc1"/>
         <w:tabs>
           <w:tab w:val="right" w:leader="dot" w:pos="9019"/>
         </w:tabs>
@@ -6871,7 +6871,7 @@
       <w:hyperlink w:anchor="_Toc234651232" w:history="1">
         <w:r>
           <w:rPr>
-            <w:rStyle w:val="Hyperlink"/>
+            <w:rStyle w:val="Siuktni"/>
             <w:noProof/>
           </w:rPr>
           <w:t>Hình 2.2. Use case của nhóm Guest</w:t>
@@ -6928,7 +6928,7 @@
     </w:p>
     <w:p>
       <w:pPr>
-        <w:pStyle w:val="TOC1"/>
+        <w:pStyle w:val="Mucluc1"/>
         <w:tabs>
           <w:tab w:val="right" w:leader="dot" w:pos="9019"/>
         </w:tabs>
@@ -6941,7 +6941,7 @@
       <w:hyperlink w:anchor="_Toc234651233" w:history="1">
         <w:r>
           <w:rPr>
-            <w:rStyle w:val="Hyperlink"/>
+            <w:rStyle w:val="Siuktni"/>
             <w:noProof/>
           </w:rPr>
           <w:t>Hình 2.3. Use case của nhóm User (không lặp lại use case kế thừa từ Guest)</w:t>
@@ -6998,7 +6998,7 @@
     </w:p>
     <w:p>
       <w:pPr>
-        <w:pStyle w:val="TOC1"/>
+        <w:pStyle w:val="Mucluc1"/>
         <w:tabs>
           <w:tab w:val="right" w:leader="dot" w:pos="9019"/>
         </w:tabs>
@@ -7011,7 +7011,7 @@
       <w:hyperlink w:anchor="_Toc234651234" w:history="1">
         <w:r>
           <w:rPr>
-            <w:rStyle w:val="Hyperlink"/>
+            <w:rStyle w:val="Siuktni"/>
             <w:noProof/>
           </w:rPr>
           <w:t>Hình 2.4. Use case của nhóm Admin (không lặp lại use case kế thừa từ User/Guest)</w:t>
@@ -7068,7 +7068,7 @@
     </w:p>
     <w:p>
       <w:pPr>
-        <w:pStyle w:val="TOC1"/>
+        <w:pStyle w:val="Mucluc1"/>
         <w:tabs>
           <w:tab w:val="right" w:leader="dot" w:pos="9019"/>
         </w:tabs>
@@ -7081,7 +7081,7 @@
       <w:hyperlink w:anchor="_Toc234651235" w:history="1">
         <w:r>
           <w:rPr>
-            <w:rStyle w:val="Hyperlink"/>
+            <w:rStyle w:val="Siuktni"/>
             <w:noProof/>
           </w:rPr>
           <w:t>Hình 4.1. Sơ đồ tuần tự luồng tìm kiếm địa danh có cache</w:t>
@@ -7138,7 +7138,7 @@
     </w:p>
     <w:p>
       <w:pPr>
-        <w:pStyle w:val="TOC1"/>
+        <w:pStyle w:val="Mucluc1"/>
         <w:tabs>
           <w:tab w:val="right" w:leader="dot" w:pos="9019"/>
         </w:tabs>
@@ -7151,7 +7151,7 @@
       <w:hyperlink w:anchor="_Toc234651236" w:history="1">
         <w:r>
           <w:rPr>
-            <w:rStyle w:val="Hyperlink"/>
+            <w:rStyle w:val="Siuktni"/>
             <w:noProof/>
           </w:rPr>
           <w:t>Hình 4.2. Sơ đồ tuần tự luồng đăng nhập có rate limit</w:t>
@@ -7208,7 +7208,7 @@
     </w:p>
     <w:p>
       <w:pPr>
-        <w:pStyle w:val="TOC1"/>
+        <w:pStyle w:val="Mucluc1"/>
         <w:tabs>
           <w:tab w:val="right" w:leader="dot" w:pos="9019"/>
         </w:tabs>
@@ -7221,7 +7221,7 @@
       <w:hyperlink w:anchor="_Toc234651237" w:history="1">
         <w:r>
           <w:rPr>
-            <w:rStyle w:val="Hyperlink"/>
+            <w:rStyle w:val="Siuktni"/>
             <w:noProof/>
           </w:rPr>
           <w:t>Hình 4.3. Sơ đồ tuần tự luồng tạo chuyến đi có audit log</w:t>
@@ -7278,7 +7278,7 @@
     </w:p>
     <w:p>
       <w:pPr>
-        <w:pStyle w:val="TOC1"/>
+        <w:pStyle w:val="Mucluc1"/>
         <w:tabs>
           <w:tab w:val="right" w:leader="dot" w:pos="9019"/>
         </w:tabs>
@@ -7291,7 +7291,7 @@
       <w:hyperlink w:anchor="_Toc234651238" w:history="1">
         <w:r>
           <w:rPr>
-            <w:rStyle w:val="Hyperlink"/>
+            <w:rStyle w:val="Siuktni"/>
             <w:noProof/>
           </w:rPr>
           <w:t>Hình 4.4. Sơ đồ tuần tự luồng sắp xếp lại lịch trình (2 pha)</w:t>
@@ -7348,7 +7348,7 @@
     </w:p>
     <w:p>
       <w:pPr>
-        <w:pStyle w:val="TOC1"/>
+        <w:pStyle w:val="Mucluc1"/>
         <w:tabs>
           <w:tab w:val="right" w:leader="dot" w:pos="9019"/>
         </w:tabs>
@@ -7361,7 +7361,7 @@
       <w:hyperlink w:anchor="_Toc234651239" w:history="1">
         <w:r>
           <w:rPr>
-            <w:rStyle w:val="Hyperlink"/>
+            <w:rStyle w:val="Siuktni"/>
             <w:noProof/>
           </w:rPr>
           <w:t>Hình 4.5. Sơ đồ tuần tự luồng cảnh báo thời tiết tự động (cron)</w:t>
@@ -7423,7 +7423,7 @@
     </w:p>
     <w:p>
       <w:pPr>
-        <w:pStyle w:val="Heading1"/>
+        <w:pStyle w:val="u1"/>
         <w:pageBreakBefore/>
       </w:pPr>
       <w:bookmarkStart w:id="4" w:name="_Toc91001"/>
@@ -7437,7 +7437,7 @@
     </w:p>
     <w:p>
       <w:pPr>
-        <w:pStyle w:val="Heading2"/>
+        <w:pStyle w:val="u2"/>
         <w:spacing w:before="160"/>
       </w:pPr>
       <w:bookmarkStart w:id="6" w:name="_Toc91002"/>
@@ -7462,7 +7462,7 @@
     </w:p>
     <w:p>
       <w:pPr>
-        <w:pStyle w:val="Heading2"/>
+        <w:pStyle w:val="u2"/>
         <w:spacing w:before="160"/>
       </w:pPr>
       <w:bookmarkStart w:id="8" w:name="_Toc91003"/>
@@ -7559,7 +7559,7 @@
     </w:p>
     <w:p>
       <w:pPr>
-        <w:pStyle w:val="Heading2"/>
+        <w:pStyle w:val="u2"/>
         <w:spacing w:before="160"/>
       </w:pPr>
       <w:bookmarkStart w:id="10" w:name="_Toc91004"/>
@@ -7632,7 +7632,7 @@
     </w:p>
     <w:p>
       <w:pPr>
-        <w:pStyle w:val="Heading2"/>
+        <w:pStyle w:val="u2"/>
         <w:spacing w:before="160"/>
       </w:pPr>
       <w:bookmarkStart w:id="12" w:name="_Toc91005"/>
@@ -7645,7 +7645,7 @@
     </w:p>
     <w:tbl>
       <w:tblPr>
-        <w:tblStyle w:val="TableGrid"/>
+        <w:tblStyle w:val="LiBang"/>
         <w:tblW w:w="0" w:type="auto"/>
         <w:tblLook w:val="04A0" w:firstRow="1" w:lastRow="0" w:firstColumn="1" w:lastColumn="0" w:noHBand="0" w:noVBand="1"/>
       </w:tblPr>
@@ -7920,7 +7920,7 @@
     <w:p/>
     <w:p>
       <w:pPr>
-        <w:pStyle w:val="Heading2"/>
+        <w:pStyle w:val="u2"/>
         <w:spacing w:before="160"/>
       </w:pPr>
       <w:bookmarkStart w:id="14" w:name="_Toc91006"/>
@@ -7933,7 +7933,7 @@
     </w:p>
     <w:p>
       <w:pPr>
-        <w:pStyle w:val="Heading3"/>
+        <w:pStyle w:val="u3"/>
       </w:pPr>
       <w:bookmarkStart w:id="16" w:name="_Toc91007"/>
       <w:bookmarkStart w:id="17" w:name="_Toc234651168"/>
@@ -7945,7 +7945,7 @@
     </w:p>
     <w:tbl>
       <w:tblPr>
-        <w:tblStyle w:val="TableGrid"/>
+        <w:tblStyle w:val="LiBang"/>
         <w:tblW w:w="0" w:type="auto"/>
         <w:tblLook w:val="04A0" w:firstRow="1" w:lastRow="0" w:firstColumn="1" w:lastColumn="0" w:noHBand="0" w:noVBand="1"/>
       </w:tblPr>
@@ -8380,7 +8380,7 @@
     <w:p/>
     <w:p>
       <w:pPr>
-        <w:pStyle w:val="Heading3"/>
+        <w:pStyle w:val="u3"/>
       </w:pPr>
       <w:bookmarkStart w:id="18" w:name="_Toc91008"/>
       <w:bookmarkStart w:id="19" w:name="_Toc234651169"/>
@@ -8392,7 +8392,7 @@
     </w:p>
     <w:tbl>
       <w:tblPr>
-        <w:tblStyle w:val="TableGrid"/>
+        <w:tblStyle w:val="LiBang"/>
         <w:tblW w:w="0" w:type="auto"/>
         <w:tblLook w:val="04A0" w:firstRow="1" w:lastRow="0" w:firstColumn="1" w:lastColumn="0" w:noHBand="0" w:noVBand="1"/>
       </w:tblPr>
@@ -9080,7 +9080,7 @@
     <w:p/>
     <w:p>
       <w:pPr>
-        <w:pStyle w:val="Heading3"/>
+        <w:pStyle w:val="u3"/>
       </w:pPr>
       <w:bookmarkStart w:id="20" w:name="_Toc91009"/>
       <w:bookmarkStart w:id="21" w:name="_Toc234651170"/>
@@ -9092,7 +9092,7 @@
     </w:p>
     <w:tbl>
       <w:tblPr>
-        <w:tblStyle w:val="TableGrid"/>
+        <w:tblStyle w:val="LiBang"/>
         <w:tblW w:w="0" w:type="auto"/>
         <w:tblLook w:val="04A0" w:firstRow="1" w:lastRow="0" w:firstColumn="1" w:lastColumn="0" w:noHBand="0" w:noVBand="1"/>
       </w:tblPr>
@@ -9317,7 +9317,7 @@
     <w:p/>
     <w:p>
       <w:pPr>
-        <w:pStyle w:val="Heading2"/>
+        <w:pStyle w:val="u2"/>
         <w:spacing w:before="160"/>
       </w:pPr>
       <w:bookmarkStart w:id="22" w:name="_Toc91010"/>
@@ -9330,7 +9330,7 @@
     </w:p>
     <w:tbl>
       <w:tblPr>
-        <w:tblStyle w:val="TableGrid"/>
+        <w:tblStyle w:val="LiBang"/>
         <w:tblW w:w="0" w:type="auto"/>
         <w:tblLook w:val="04A0" w:firstRow="1" w:lastRow="0" w:firstColumn="1" w:lastColumn="0" w:noHBand="0" w:noVBand="1"/>
       </w:tblPr>
@@ -9808,7 +9808,7 @@
     <w:p/>
     <w:p>
       <w:pPr>
-        <w:pStyle w:val="Heading2"/>
+        <w:pStyle w:val="u2"/>
         <w:spacing w:before="160"/>
       </w:pPr>
       <w:bookmarkStart w:id="24" w:name="_Toc91011"/>
@@ -9929,7 +9929,7 @@
     </w:p>
     <w:p>
       <w:pPr>
-        <w:pStyle w:val="Heading1"/>
+        <w:pStyle w:val="u1"/>
         <w:pageBreakBefore/>
       </w:pPr>
       <w:bookmarkStart w:id="26" w:name="_Toc91012"/>
@@ -9943,7 +9943,7 @@
     </w:p>
     <w:p>
       <w:pPr>
-        <w:pStyle w:val="Heading2"/>
+        <w:pStyle w:val="u2"/>
         <w:spacing w:before="160"/>
       </w:pPr>
       <w:bookmarkStart w:id="28" w:name="_Toc91013"/>
@@ -10049,7 +10049,7 @@
     </w:p>
     <w:p>
       <w:pPr>
-        <w:pStyle w:val="Heading2"/>
+        <w:pStyle w:val="u2"/>
         <w:spacing w:before="160"/>
       </w:pPr>
       <w:bookmarkStart w:id="32" w:name="_Toc91015"/>
@@ -10062,7 +10062,7 @@
     </w:p>
     <w:tbl>
       <w:tblPr>
-        <w:tblStyle w:val="TableGrid"/>
+        <w:tblStyle w:val="LiBang"/>
         <w:tblW w:w="0" w:type="auto"/>
         <w:tblLook w:val="04A0" w:firstRow="1" w:lastRow="0" w:firstColumn="1" w:lastColumn="0" w:noHBand="0" w:noVBand="1"/>
       </w:tblPr>
@@ -11932,7 +11932,7 @@
     </w:p>
     <w:p>
       <w:pPr>
-        <w:pStyle w:val="Heading2"/>
+        <w:pStyle w:val="u2"/>
         <w:spacing w:before="160"/>
       </w:pPr>
       <w:bookmarkStart w:id="40" w:name="_Toc91019"/>
@@ -11945,7 +11945,7 @@
     </w:p>
     <w:p>
       <w:pPr>
-        <w:pStyle w:val="Heading3"/>
+        <w:pStyle w:val="u3"/>
       </w:pPr>
       <w:bookmarkStart w:id="42" w:name="_Toc91020"/>
       <w:bookmarkStart w:id="43" w:name="_Toc234651177"/>
@@ -11957,7 +11957,7 @@
     </w:p>
     <w:tbl>
       <w:tblPr>
-        <w:tblStyle w:val="TableGrid"/>
+        <w:tblStyle w:val="LiBang"/>
         <w:tblW w:w="0" w:type="auto"/>
         <w:tblLook w:val="04A0" w:firstRow="1" w:lastRow="0" w:firstColumn="1" w:lastColumn="0" w:noHBand="0" w:noVBand="1"/>
       </w:tblPr>
@@ -12172,7 +12172,7 @@
     <w:p/>
     <w:p>
       <w:pPr>
-        <w:pStyle w:val="Heading3"/>
+        <w:pStyle w:val="u3"/>
       </w:pPr>
       <w:bookmarkStart w:id="44" w:name="_Toc91021"/>
       <w:bookmarkStart w:id="45" w:name="_Toc234651178"/>
@@ -12184,7 +12184,7 @@
     </w:p>
     <w:tbl>
       <w:tblPr>
-        <w:tblStyle w:val="TableGrid"/>
+        <w:tblStyle w:val="LiBang"/>
         <w:tblW w:w="0" w:type="auto"/>
         <w:tblLook w:val="04A0" w:firstRow="1" w:lastRow="0" w:firstColumn="1" w:lastColumn="0" w:noHBand="0" w:noVBand="1"/>
       </w:tblPr>
@@ -12416,7 +12416,7 @@
     <w:p/>
     <w:p>
       <w:pPr>
-        <w:pStyle w:val="Heading3"/>
+        <w:pStyle w:val="u3"/>
       </w:pPr>
       <w:bookmarkStart w:id="46" w:name="_Toc91022"/>
       <w:bookmarkStart w:id="47" w:name="_Toc234651179"/>
@@ -12428,7 +12428,7 @@
     </w:p>
     <w:tbl>
       <w:tblPr>
-        <w:tblStyle w:val="TableGrid"/>
+        <w:tblStyle w:val="LiBang"/>
         <w:tblW w:w="0" w:type="auto"/>
         <w:tblLook w:val="04A0" w:firstRow="1" w:lastRow="0" w:firstColumn="1" w:lastColumn="0" w:noHBand="0" w:noVBand="1"/>
       </w:tblPr>
@@ -12651,7 +12651,7 @@
     <w:p/>
     <w:p>
       <w:pPr>
-        <w:pStyle w:val="Heading3"/>
+        <w:pStyle w:val="u3"/>
       </w:pPr>
       <w:bookmarkStart w:id="48" w:name="_Toc91023"/>
       <w:bookmarkStart w:id="49" w:name="_Toc234651180"/>
@@ -12663,7 +12663,7 @@
     </w:p>
     <w:tbl>
       <w:tblPr>
-        <w:tblStyle w:val="TableGrid"/>
+        <w:tblStyle w:val="LiBang"/>
         <w:tblW w:w="0" w:type="auto"/>
         <w:tblLook w:val="04A0" w:firstRow="1" w:lastRow="0" w:firstColumn="1" w:lastColumn="0" w:noHBand="0" w:noVBand="1"/>
       </w:tblPr>
@@ -12878,7 +12878,7 @@
     <w:p/>
     <w:p>
       <w:pPr>
-        <w:pStyle w:val="Heading3"/>
+        <w:pStyle w:val="u3"/>
       </w:pPr>
       <w:bookmarkStart w:id="50" w:name="_Toc91024"/>
       <w:bookmarkStart w:id="51" w:name="_Toc234651181"/>
@@ -12890,7 +12890,7 @@
     </w:p>
     <w:tbl>
       <w:tblPr>
-        <w:tblStyle w:val="TableGrid"/>
+        <w:tblStyle w:val="LiBang"/>
         <w:tblW w:w="0" w:type="auto"/>
         <w:tblLook w:val="04A0" w:firstRow="1" w:lastRow="0" w:firstColumn="1" w:lastColumn="0" w:noHBand="0" w:noVBand="1"/>
       </w:tblPr>
@@ -13113,7 +13113,7 @@
     <w:p/>
     <w:p>
       <w:pPr>
-        <w:pStyle w:val="Heading3"/>
+        <w:pStyle w:val="u3"/>
       </w:pPr>
       <w:bookmarkStart w:id="52" w:name="_Toc91025"/>
       <w:bookmarkStart w:id="53" w:name="_Toc234651182"/>
@@ -13125,7 +13125,7 @@
     </w:p>
     <w:tbl>
       <w:tblPr>
-        <w:tblStyle w:val="TableGrid"/>
+        <w:tblStyle w:val="LiBang"/>
         <w:tblW w:w="0" w:type="auto"/>
         <w:tblLook w:val="04A0" w:firstRow="1" w:lastRow="0" w:firstColumn="1" w:lastColumn="0" w:noHBand="0" w:noVBand="1"/>
       </w:tblPr>
@@ -13348,7 +13348,7 @@
     <w:p/>
     <w:p>
       <w:pPr>
-        <w:pStyle w:val="Heading3"/>
+        <w:pStyle w:val="u3"/>
       </w:pPr>
       <w:bookmarkStart w:id="54" w:name="_Toc91026"/>
       <w:bookmarkStart w:id="55" w:name="_Toc234651183"/>
@@ -13360,7 +13360,7 @@
     </w:p>
     <w:tbl>
       <w:tblPr>
-        <w:tblStyle w:val="TableGrid"/>
+        <w:tblStyle w:val="LiBang"/>
         <w:tblW w:w="0" w:type="auto"/>
         <w:tblLook w:val="04A0" w:firstRow="1" w:lastRow="0" w:firstColumn="1" w:lastColumn="0" w:noHBand="0" w:noVBand="1"/>
       </w:tblPr>
@@ -13583,7 +13583,7 @@
     <w:p/>
     <w:p>
       <w:pPr>
-        <w:pStyle w:val="Heading3"/>
+        <w:pStyle w:val="u3"/>
       </w:pPr>
       <w:bookmarkStart w:id="56" w:name="_Toc91027"/>
       <w:bookmarkStart w:id="57" w:name="_Toc234651184"/>
@@ -13595,7 +13595,7 @@
     </w:p>
     <w:tbl>
       <w:tblPr>
-        <w:tblStyle w:val="TableGrid"/>
+        <w:tblStyle w:val="LiBang"/>
         <w:tblW w:w="0" w:type="auto"/>
         <w:tblLook w:val="04A0" w:firstRow="1" w:lastRow="0" w:firstColumn="1" w:lastColumn="0" w:noHBand="0" w:noVBand="1"/>
       </w:tblPr>
@@ -13818,7 +13818,7 @@
     <w:p/>
     <w:p>
       <w:pPr>
-        <w:pStyle w:val="Heading3"/>
+        <w:pStyle w:val="u3"/>
       </w:pPr>
       <w:bookmarkStart w:id="58" w:name="_Toc91028"/>
       <w:bookmarkStart w:id="59" w:name="_Toc234651185"/>
@@ -13830,7 +13830,7 @@
     </w:p>
     <w:tbl>
       <w:tblPr>
-        <w:tblStyle w:val="TableGrid"/>
+        <w:tblStyle w:val="LiBang"/>
         <w:tblW w:w="0" w:type="auto"/>
         <w:tblLook w:val="04A0" w:firstRow="1" w:lastRow="0" w:firstColumn="1" w:lastColumn="0" w:noHBand="0" w:noVBand="1"/>
       </w:tblPr>
@@ -14045,7 +14045,7 @@
     <w:p/>
     <w:p>
       <w:pPr>
-        <w:pStyle w:val="Heading3"/>
+        <w:pStyle w:val="u3"/>
       </w:pPr>
       <w:bookmarkStart w:id="60" w:name="_Toc91029"/>
       <w:bookmarkStart w:id="61" w:name="_Toc234651186"/>
@@ -14057,7 +14057,7 @@
     </w:p>
     <w:tbl>
       <w:tblPr>
-        <w:tblStyle w:val="TableGrid"/>
+        <w:tblStyle w:val="LiBang"/>
         <w:tblW w:w="0" w:type="auto"/>
         <w:tblLook w:val="04A0" w:firstRow="1" w:lastRow="0" w:firstColumn="1" w:lastColumn="0" w:noHBand="0" w:noVBand="1"/>
       </w:tblPr>
@@ -14271,7 +14271,7 @@
     <w:p/>
     <w:p>
       <w:pPr>
-        <w:pStyle w:val="Heading3"/>
+        <w:pStyle w:val="u3"/>
       </w:pPr>
       <w:bookmarkStart w:id="62" w:name="_Toc91030"/>
       <w:bookmarkStart w:id="63" w:name="_Toc234651187"/>
@@ -14283,7 +14283,7 @@
     </w:p>
     <w:tbl>
       <w:tblPr>
-        <w:tblStyle w:val="TableGrid"/>
+        <w:tblStyle w:val="LiBang"/>
         <w:tblW w:w="0" w:type="auto"/>
         <w:tblLook w:val="04A0" w:firstRow="1" w:lastRow="0" w:firstColumn="1" w:lastColumn="0" w:noHBand="0" w:noVBand="1"/>
       </w:tblPr>
@@ -14506,7 +14506,7 @@
     <w:p/>
     <w:p>
       <w:pPr>
-        <w:pStyle w:val="Heading3"/>
+        <w:pStyle w:val="u3"/>
       </w:pPr>
       <w:bookmarkStart w:id="64" w:name="_Toc91031"/>
       <w:bookmarkStart w:id="65" w:name="_Toc234651188"/>
@@ -14518,7 +14518,7 @@
     </w:p>
     <w:tbl>
       <w:tblPr>
-        <w:tblStyle w:val="TableGrid"/>
+        <w:tblStyle w:val="LiBang"/>
         <w:tblW w:w="0" w:type="auto"/>
         <w:tblLook w:val="04A0" w:firstRow="1" w:lastRow="0" w:firstColumn="1" w:lastColumn="0" w:noHBand="0" w:noVBand="1"/>
       </w:tblPr>
@@ -14743,7 +14743,7 @@
     <w:p/>
     <w:p>
       <w:pPr>
-        <w:pStyle w:val="Heading3"/>
+        <w:pStyle w:val="u3"/>
       </w:pPr>
       <w:bookmarkStart w:id="66" w:name="_Toc91032"/>
       <w:bookmarkStart w:id="67" w:name="_Toc234651189"/>
@@ -14755,7 +14755,7 @@
     </w:p>
     <w:tbl>
       <w:tblPr>
-        <w:tblStyle w:val="TableGrid"/>
+        <w:tblStyle w:val="LiBang"/>
         <w:tblW w:w="0" w:type="auto"/>
         <w:tblLook w:val="04A0" w:firstRow="1" w:lastRow="0" w:firstColumn="1" w:lastColumn="0" w:noHBand="0" w:noVBand="1"/>
       </w:tblPr>
@@ -14978,7 +14978,7 @@
     <w:p/>
     <w:p>
       <w:pPr>
-        <w:pStyle w:val="Heading3"/>
+        <w:pStyle w:val="u3"/>
       </w:pPr>
       <w:bookmarkStart w:id="68" w:name="_Toc91033"/>
       <w:bookmarkStart w:id="69" w:name="_Toc234651190"/>
@@ -14990,7 +14990,7 @@
     </w:p>
     <w:tbl>
       <w:tblPr>
-        <w:tblStyle w:val="TableGrid"/>
+        <w:tblStyle w:val="LiBang"/>
         <w:tblW w:w="0" w:type="auto"/>
         <w:tblLook w:val="04A0" w:firstRow="1" w:lastRow="0" w:firstColumn="1" w:lastColumn="0" w:noHBand="0" w:noVBand="1"/>
       </w:tblPr>
@@ -15213,7 +15213,7 @@
     <w:p/>
     <w:p>
       <w:pPr>
-        <w:pStyle w:val="Heading3"/>
+        <w:pStyle w:val="u3"/>
       </w:pPr>
       <w:bookmarkStart w:id="70" w:name="_Toc91034"/>
       <w:bookmarkStart w:id="71" w:name="_Toc234651191"/>
@@ -15225,7 +15225,7 @@
     </w:p>
     <w:tbl>
       <w:tblPr>
-        <w:tblStyle w:val="TableGrid"/>
+        <w:tblStyle w:val="LiBang"/>
         <w:tblW w:w="0" w:type="auto"/>
         <w:tblLook w:val="04A0" w:firstRow="1" w:lastRow="0" w:firstColumn="1" w:lastColumn="0" w:noHBand="0" w:noVBand="1"/>
       </w:tblPr>
@@ -15440,7 +15440,7 @@
     <w:p/>
     <w:p>
       <w:pPr>
-        <w:pStyle w:val="Heading3"/>
+        <w:pStyle w:val="u3"/>
       </w:pPr>
       <w:bookmarkStart w:id="72" w:name="_Toc91035"/>
       <w:bookmarkStart w:id="73" w:name="_Toc234651192"/>
@@ -15452,7 +15452,7 @@
     </w:p>
     <w:tbl>
       <w:tblPr>
-        <w:tblStyle w:val="TableGrid"/>
+        <w:tblStyle w:val="LiBang"/>
         <w:tblW w:w="0" w:type="auto"/>
         <w:tblLook w:val="04A0" w:firstRow="1" w:lastRow="0" w:firstColumn="1" w:lastColumn="0" w:noHBand="0" w:noVBand="1"/>
       </w:tblPr>
@@ -15666,7 +15666,7 @@
     <w:p/>
     <w:p>
       <w:pPr>
-        <w:pStyle w:val="Heading3"/>
+        <w:pStyle w:val="u3"/>
       </w:pPr>
       <w:bookmarkStart w:id="74" w:name="_Toc91036"/>
       <w:bookmarkStart w:id="75" w:name="_Toc234651193"/>
@@ -15678,7 +15678,7 @@
     </w:p>
     <w:tbl>
       <w:tblPr>
-        <w:tblStyle w:val="TableGrid"/>
+        <w:tblStyle w:val="LiBang"/>
         <w:tblW w:w="0" w:type="auto"/>
         <w:tblLook w:val="04A0" w:firstRow="1" w:lastRow="0" w:firstColumn="1" w:lastColumn="0" w:noHBand="0" w:noVBand="1"/>
       </w:tblPr>
@@ -15893,7 +15893,7 @@
     <w:p/>
     <w:p>
       <w:pPr>
-        <w:pStyle w:val="Heading3"/>
+        <w:pStyle w:val="u3"/>
       </w:pPr>
       <w:bookmarkStart w:id="76" w:name="_Toc91037"/>
       <w:bookmarkStart w:id="77" w:name="_Toc234651194"/>
@@ -15905,7 +15905,7 @@
     </w:p>
     <w:tbl>
       <w:tblPr>
-        <w:tblStyle w:val="TableGrid"/>
+        <w:tblStyle w:val="LiBang"/>
         <w:tblW w:w="0" w:type="auto"/>
         <w:tblLook w:val="04A0" w:firstRow="1" w:lastRow="0" w:firstColumn="1" w:lastColumn="0" w:noHBand="0" w:noVBand="1"/>
       </w:tblPr>
@@ -16119,7 +16119,7 @@
     <w:p/>
     <w:p>
       <w:pPr>
-        <w:pStyle w:val="Heading3"/>
+        <w:pStyle w:val="u3"/>
       </w:pPr>
       <w:bookmarkStart w:id="78" w:name="_Toc91038"/>
       <w:bookmarkStart w:id="79" w:name="_Toc234651195"/>
@@ -16131,7 +16131,7 @@
     </w:p>
     <w:tbl>
       <w:tblPr>
-        <w:tblStyle w:val="TableGrid"/>
+        <w:tblStyle w:val="LiBang"/>
         <w:tblW w:w="0" w:type="auto"/>
         <w:tblLook w:val="04A0" w:firstRow="1" w:lastRow="0" w:firstColumn="1" w:lastColumn="0" w:noHBand="0" w:noVBand="1"/>
       </w:tblPr>
@@ -16345,7 +16345,7 @@
     <w:p/>
     <w:p>
       <w:pPr>
-        <w:pStyle w:val="Heading3"/>
+        <w:pStyle w:val="u3"/>
       </w:pPr>
       <w:bookmarkStart w:id="80" w:name="_Toc91039"/>
       <w:bookmarkStart w:id="81" w:name="_Toc234651196"/>
@@ -16357,7 +16357,7 @@
     </w:p>
     <w:tbl>
       <w:tblPr>
-        <w:tblStyle w:val="TableGrid"/>
+        <w:tblStyle w:val="LiBang"/>
         <w:tblW w:w="0" w:type="auto"/>
         <w:tblLook w:val="04A0" w:firstRow="1" w:lastRow="0" w:firstColumn="1" w:lastColumn="0" w:noHBand="0" w:noVBand="1"/>
       </w:tblPr>
@@ -16573,7 +16573,7 @@
     <w:p/>
     <w:p>
       <w:pPr>
-        <w:pStyle w:val="Heading3"/>
+        <w:pStyle w:val="u3"/>
       </w:pPr>
       <w:bookmarkStart w:id="82" w:name="_Toc91040"/>
       <w:bookmarkStart w:id="83" w:name="_Toc234651197"/>
@@ -16585,7 +16585,7 @@
     </w:p>
     <w:tbl>
       <w:tblPr>
-        <w:tblStyle w:val="TableGrid"/>
+        <w:tblStyle w:val="LiBang"/>
         <w:tblW w:w="0" w:type="auto"/>
         <w:tblLook w:val="04A0" w:firstRow="1" w:lastRow="0" w:firstColumn="1" w:lastColumn="0" w:noHBand="0" w:noVBand="1"/>
       </w:tblPr>
@@ -16799,7 +16799,7 @@
     <w:p/>
     <w:p>
       <w:pPr>
-        <w:pStyle w:val="Heading3"/>
+        <w:pStyle w:val="u3"/>
       </w:pPr>
       <w:bookmarkStart w:id="84" w:name="_Toc91041"/>
       <w:bookmarkStart w:id="85" w:name="_Toc234651198"/>
@@ -16811,7 +16811,7 @@
     </w:p>
     <w:tbl>
       <w:tblPr>
-        <w:tblStyle w:val="TableGrid"/>
+        <w:tblStyle w:val="LiBang"/>
         <w:tblW w:w="0" w:type="auto"/>
         <w:tblLook w:val="04A0" w:firstRow="1" w:lastRow="0" w:firstColumn="1" w:lastColumn="0" w:noHBand="0" w:noVBand="1"/>
       </w:tblPr>
@@ -17034,7 +17034,7 @@
     <w:p/>
     <w:p>
       <w:pPr>
-        <w:pStyle w:val="Heading3"/>
+        <w:pStyle w:val="u3"/>
       </w:pPr>
       <w:bookmarkStart w:id="86" w:name="_Toc91042"/>
       <w:bookmarkStart w:id="87" w:name="_Toc234651199"/>
@@ -17046,7 +17046,7 @@
     </w:p>
     <w:tbl>
       <w:tblPr>
-        <w:tblStyle w:val="TableGrid"/>
+        <w:tblStyle w:val="LiBang"/>
         <w:tblW w:w="0" w:type="auto"/>
         <w:tblLook w:val="04A0" w:firstRow="1" w:lastRow="0" w:firstColumn="1" w:lastColumn="0" w:noHBand="0" w:noVBand="1"/>
       </w:tblPr>
@@ -17252,7 +17252,7 @@
     <w:p/>
     <w:p>
       <w:pPr>
-        <w:pStyle w:val="Heading3"/>
+        <w:pStyle w:val="u3"/>
       </w:pPr>
       <w:bookmarkStart w:id="88" w:name="_Toc91043"/>
       <w:bookmarkStart w:id="89" w:name="_Toc234651200"/>
@@ -17264,7 +17264,7 @@
     </w:p>
     <w:tbl>
       <w:tblPr>
-        <w:tblStyle w:val="TableGrid"/>
+        <w:tblStyle w:val="LiBang"/>
         <w:tblW w:w="0" w:type="auto"/>
         <w:tblLook w:val="04A0" w:firstRow="1" w:lastRow="0" w:firstColumn="1" w:lastColumn="0" w:noHBand="0" w:noVBand="1"/>
       </w:tblPr>
@@ -17478,7 +17478,7 @@
     <w:p/>
     <w:p>
       <w:pPr>
-        <w:pStyle w:val="Heading3"/>
+        <w:pStyle w:val="u3"/>
       </w:pPr>
       <w:bookmarkStart w:id="90" w:name="_Toc91044"/>
       <w:bookmarkStart w:id="91" w:name="_Toc234651201"/>
@@ -17490,7 +17490,7 @@
     </w:p>
     <w:tbl>
       <w:tblPr>
-        <w:tblStyle w:val="TableGrid"/>
+        <w:tblStyle w:val="LiBang"/>
         <w:tblW w:w="0" w:type="auto"/>
         <w:tblLook w:val="04A0" w:firstRow="1" w:lastRow="0" w:firstColumn="1" w:lastColumn="0" w:noHBand="0" w:noVBand="1"/>
       </w:tblPr>
@@ -17713,7 +17713,7 @@
     <w:p/>
     <w:p>
       <w:pPr>
-        <w:pStyle w:val="Heading3"/>
+        <w:pStyle w:val="u3"/>
       </w:pPr>
       <w:bookmarkStart w:id="92" w:name="_Toc91045"/>
       <w:bookmarkStart w:id="93" w:name="_Toc234651202"/>
@@ -17726,7 +17726,7 @@
     </w:p>
     <w:tbl>
       <w:tblPr>
-        <w:tblStyle w:val="TableGrid"/>
+        <w:tblStyle w:val="LiBang"/>
         <w:tblW w:w="0" w:type="auto"/>
         <w:tblLook w:val="04A0" w:firstRow="1" w:lastRow="0" w:firstColumn="1" w:lastColumn="0" w:noHBand="0" w:noVBand="1"/>
       </w:tblPr>
@@ -17940,7 +17940,7 @@
     <w:p/>
     <w:p>
       <w:pPr>
-        <w:pStyle w:val="Heading3"/>
+        <w:pStyle w:val="u3"/>
       </w:pPr>
       <w:bookmarkStart w:id="94" w:name="_Toc91046"/>
       <w:bookmarkStart w:id="95" w:name="_Toc234651203"/>
@@ -17952,7 +17952,7 @@
     </w:p>
     <w:tbl>
       <w:tblPr>
-        <w:tblStyle w:val="TableGrid"/>
+        <w:tblStyle w:val="LiBang"/>
         <w:tblW w:w="0" w:type="auto"/>
         <w:tblLook w:val="04A0" w:firstRow="1" w:lastRow="0" w:firstColumn="1" w:lastColumn="0" w:noHBand="0" w:noVBand="1"/>
       </w:tblPr>
@@ -18166,7 +18166,7 @@
     <w:p/>
     <w:p>
       <w:pPr>
-        <w:pStyle w:val="Heading3"/>
+        <w:pStyle w:val="u3"/>
       </w:pPr>
       <w:bookmarkStart w:id="96" w:name="_Toc91047"/>
       <w:bookmarkStart w:id="97" w:name="_Toc234651204"/>
@@ -18178,7 +18178,7 @@
     </w:p>
     <w:tbl>
       <w:tblPr>
-        <w:tblStyle w:val="TableGrid"/>
+        <w:tblStyle w:val="LiBang"/>
         <w:tblW w:w="0" w:type="auto"/>
         <w:tblLook w:val="04A0" w:firstRow="1" w:lastRow="0" w:firstColumn="1" w:lastColumn="0" w:noHBand="0" w:noVBand="1"/>
       </w:tblPr>
@@ -18392,7 +18392,7 @@
     <w:p/>
     <w:p>
       <w:pPr>
-        <w:pStyle w:val="Heading1"/>
+        <w:pStyle w:val="u1"/>
         <w:pageBreakBefore/>
       </w:pPr>
       <w:bookmarkStart w:id="98" w:name="_Toc91048"/>
@@ -18406,7 +18406,7 @@
     </w:p>
     <w:p>
       <w:pPr>
-        <w:pStyle w:val="Heading2"/>
+        <w:pStyle w:val="u2"/>
         <w:spacing w:before="160"/>
       </w:pPr>
       <w:bookmarkStart w:id="100" w:name="_Toc91049"/>
@@ -18431,7 +18431,7 @@
     </w:p>
     <w:p>
       <w:pPr>
-        <w:pStyle w:val="Heading2"/>
+        <w:pStyle w:val="u2"/>
         <w:spacing w:before="160"/>
       </w:pPr>
       <w:bookmarkStart w:id="102" w:name="_Toc91050"/>
@@ -18452,7 +18452,7 @@
     </w:p>
     <w:tbl>
       <w:tblPr>
-        <w:tblStyle w:val="TableGrid"/>
+        <w:tblStyle w:val="LiBang"/>
         <w:tblW w:w="0" w:type="auto"/>
         <w:tblLook w:val="04A0" w:firstRow="1" w:lastRow="0" w:firstColumn="1" w:lastColumn="0" w:noHBand="0" w:noVBand="1"/>
       </w:tblPr>
@@ -19820,7 +19820,7 @@
     </w:p>
     <w:tbl>
       <w:tblPr>
-        <w:tblStyle w:val="TableGrid"/>
+        <w:tblStyle w:val="LiBang"/>
         <w:tblW w:w="0" w:type="auto"/>
         <w:tblLook w:val="04A0" w:firstRow="1" w:lastRow="0" w:firstColumn="1" w:lastColumn="0" w:noHBand="0" w:noVBand="1"/>
       </w:tblPr>
@@ -20676,7 +20676,7 @@
     <w:p/>
     <w:p>
       <w:pPr>
-        <w:pStyle w:val="Heading2"/>
+        <w:pStyle w:val="u2"/>
         <w:spacing w:before="160"/>
       </w:pPr>
       <w:bookmarkStart w:id="104" w:name="_Toc91051"/>
@@ -20689,7 +20689,7 @@
     </w:p>
     <w:tbl>
       <w:tblPr>
-        <w:tblStyle w:val="TableGrid"/>
+        <w:tblStyle w:val="LiBang"/>
         <w:tblW w:w="0" w:type="auto"/>
         <w:tblLook w:val="04A0" w:firstRow="1" w:lastRow="0" w:firstColumn="1" w:lastColumn="0" w:noHBand="0" w:noVBand="1"/>
       </w:tblPr>
@@ -21377,7 +21377,7 @@
     <w:p/>
     <w:p>
       <w:pPr>
-        <w:pStyle w:val="Heading2"/>
+        <w:pStyle w:val="u2"/>
         <w:spacing w:before="160"/>
       </w:pPr>
       <w:bookmarkStart w:id="106" w:name="_Toc91052"/>
@@ -21390,7 +21390,7 @@
     </w:p>
     <w:tbl>
       <w:tblPr>
-        <w:tblStyle w:val="TableGrid"/>
+        <w:tblStyle w:val="LiBang"/>
         <w:tblW w:w="0" w:type="auto"/>
         <w:tblLook w:val="04A0" w:firstRow="1" w:lastRow="0" w:firstColumn="1" w:lastColumn="0" w:noHBand="0" w:noVBand="1"/>
       </w:tblPr>
@@ -21922,7 +21922,7 @@
     </w:p>
     <w:p>
       <w:pPr>
-        <w:pStyle w:val="Heading2"/>
+        <w:pStyle w:val="u2"/>
         <w:spacing w:before="160"/>
       </w:pPr>
       <w:bookmarkStart w:id="108" w:name="_Toc91053"/>
@@ -21935,7 +21935,7 @@
     </w:p>
     <w:tbl>
       <w:tblPr>
-        <w:tblStyle w:val="TableGrid"/>
+        <w:tblStyle w:val="LiBang"/>
         <w:tblW w:w="0" w:type="auto"/>
         <w:tblLook w:val="04A0" w:firstRow="1" w:lastRow="0" w:firstColumn="1" w:lastColumn="0" w:noHBand="0" w:noVBand="1"/>
       </w:tblPr>
@@ -22589,7 +22589,7 @@
     <w:p/>
     <w:p>
       <w:pPr>
-        <w:pStyle w:val="Heading1"/>
+        <w:pStyle w:val="u1"/>
         <w:pageBreakBefore/>
       </w:pPr>
       <w:bookmarkStart w:id="110" w:name="_Toc91054"/>
@@ -22603,7 +22603,7 @@
     </w:p>
     <w:p>
       <w:pPr>
-        <w:pStyle w:val="Heading2"/>
+        <w:pStyle w:val="u2"/>
         <w:spacing w:before="160"/>
       </w:pPr>
       <w:bookmarkStart w:id="112" w:name="_Toc91055"/>
@@ -22697,7 +22697,7 @@
     </w:p>
     <w:p>
       <w:pPr>
-        <w:pStyle w:val="Heading2"/>
+        <w:pStyle w:val="u2"/>
         <w:spacing w:before="160"/>
       </w:pPr>
       <w:bookmarkStart w:id="116" w:name="_Toc91057"/>
@@ -22791,7 +22791,7 @@
     </w:p>
     <w:p>
       <w:pPr>
-        <w:pStyle w:val="Heading2"/>
+        <w:pStyle w:val="u2"/>
         <w:spacing w:before="160"/>
       </w:pPr>
       <w:bookmarkStart w:id="120" w:name="_Toc91059"/>
@@ -22886,7 +22886,7 @@
     </w:p>
     <w:p>
       <w:pPr>
-        <w:pStyle w:val="Heading2"/>
+        <w:pStyle w:val="u2"/>
         <w:spacing w:before="160"/>
       </w:pPr>
       <w:bookmarkStart w:id="124" w:name="_Toc91061"/>
@@ -22992,7 +22992,7 @@
     </w:p>
     <w:p>
       <w:pPr>
-        <w:pStyle w:val="Heading2"/>
+        <w:pStyle w:val="u2"/>
         <w:spacing w:before="160"/>
       </w:pPr>
       <w:bookmarkStart w:id="128" w:name="_Toc91063"/>
@@ -23099,7 +23099,7 @@
     </w:p>
     <w:p>
       <w:pPr>
-        <w:pStyle w:val="Heading1"/>
+        <w:pStyle w:val="u1"/>
         <w:pageBreakBefore/>
       </w:pPr>
       <w:bookmarkStart w:id="132" w:name="_Toc91065"/>
@@ -23113,7 +23113,7 @@
     </w:p>
     <w:p>
       <w:pPr>
-        <w:pStyle w:val="Heading2"/>
+        <w:pStyle w:val="u2"/>
         <w:spacing w:before="160"/>
       </w:pPr>
       <w:bookmarkStart w:id="134" w:name="_Toc91066"/>
@@ -23126,7 +23126,7 @@
     </w:p>
     <w:tbl>
       <w:tblPr>
-        <w:tblStyle w:val="TableGrid"/>
+        <w:tblStyle w:val="LiBang"/>
         <w:tblW w:w="0" w:type="auto"/>
         <w:tblLook w:val="04A0" w:firstRow="1" w:lastRow="0" w:firstColumn="1" w:lastColumn="0" w:noHBand="0" w:noVBand="1"/>
       </w:tblPr>
@@ -23470,7 +23470,7 @@
     <w:p/>
     <w:p>
       <w:pPr>
-        <w:pStyle w:val="Heading2"/>
+        <w:pStyle w:val="u2"/>
         <w:spacing w:before="160"/>
       </w:pPr>
       <w:bookmarkStart w:id="136" w:name="_Toc91067"/>
@@ -23483,7 +23483,7 @@
     </w:p>
     <w:tbl>
       <w:tblPr>
-        <w:tblStyle w:val="TableGrid"/>
+        <w:tblStyle w:val="LiBang"/>
         <w:tblW w:w="0" w:type="auto"/>
         <w:tblLook w:val="04A0" w:firstRow="1" w:lastRow="0" w:firstColumn="1" w:lastColumn="0" w:noHBand="0" w:noVBand="1"/>
       </w:tblPr>
@@ -23496,7 +23496,6 @@
             <w:tcW w:w="9022" w:type="dxa"/>
           </w:tcPr>
           <w:p>
-            <w:bookmarkStart w:id="138" w:name="_GoBack" w:colFirst="0" w:colLast="0"/>
             <w:r>
               <w:rPr>
                 <w:sz w:val="26"/>
@@ -23714,25 +23713,24 @@
           </w:p>
         </w:tc>
       </w:tr>
-      <w:bookmarkEnd w:id="138"/>
     </w:tbl>
     <w:p/>
     <w:p>
       <w:pPr>
-        <w:pStyle w:val="Heading2"/>
+        <w:pStyle w:val="u2"/>
         <w:spacing w:before="160"/>
       </w:pPr>
-      <w:bookmarkStart w:id="139" w:name="_Toc91068"/>
-      <w:bookmarkStart w:id="140" w:name="_Toc234651220"/>
+      <w:bookmarkStart w:id="138" w:name="_Toc91068"/>
+      <w:bookmarkStart w:id="139" w:name="_Toc234651220"/>
       <w:r>
         <w:t>5.3. Biến môi trường thực tế</w:t>
       </w:r>
+      <w:bookmarkEnd w:id="138"/>
       <w:bookmarkEnd w:id="139"/>
-      <w:bookmarkEnd w:id="140"/>
     </w:p>
     <w:tbl>
       <w:tblPr>
-        <w:tblStyle w:val="TableGrid"/>
+        <w:tblStyle w:val="LiBang"/>
         <w:tblW w:w="0" w:type="auto"/>
         <w:tblLook w:val="04A0" w:firstRow="1" w:lastRow="0" w:firstColumn="1" w:lastColumn="0" w:noHBand="0" w:noVBand="1"/>
       </w:tblPr>
@@ -24104,20 +24102,20 @@
     <w:p/>
     <w:p>
       <w:pPr>
-        <w:pStyle w:val="Heading2"/>
+        <w:pStyle w:val="u2"/>
         <w:spacing w:before="160"/>
       </w:pPr>
-      <w:bookmarkStart w:id="141" w:name="_Toc91069"/>
-      <w:bookmarkStart w:id="142" w:name="_Toc234651221"/>
+      <w:bookmarkStart w:id="140" w:name="_Toc91069"/>
+      <w:bookmarkStart w:id="141" w:name="_Toc234651221"/>
       <w:r>
         <w:t>5.4. Docker Compose local</w:t>
       </w:r>
+      <w:bookmarkEnd w:id="140"/>
       <w:bookmarkEnd w:id="141"/>
-      <w:bookmarkEnd w:id="142"/>
     </w:p>
     <w:tbl>
       <w:tblPr>
-        <w:tblStyle w:val="TableGrid"/>
+        <w:tblStyle w:val="LiBang"/>
         <w:tblW w:w="0" w:type="auto"/>
         <w:tblLook w:val="04A0" w:firstRow="1" w:lastRow="0" w:firstColumn="1" w:lastColumn="0" w:noHBand="0" w:noVBand="1"/>
       </w:tblPr>
@@ -24257,17 +24255,17 @@
     <w:p/>
     <w:p>
       <w:pPr>
-        <w:pStyle w:val="Heading2"/>
+        <w:pStyle w:val="u2"/>
         <w:spacing w:before="160"/>
       </w:pPr>
-      <w:bookmarkStart w:id="143" w:name="_Toc91070"/>
-      <w:bookmarkStart w:id="144" w:name="_Toc234651222"/>
+      <w:bookmarkStart w:id="142" w:name="_Toc91070"/>
+      <w:bookmarkStart w:id="143" w:name="_Toc234651222"/>
       <w:r>
         <w:lastRenderedPageBreak/>
         <w:t>5.5. Tầng dữ liệu và script vận hành</w:t>
       </w:r>
+      <w:bookmarkEnd w:id="142"/>
       <w:bookmarkEnd w:id="143"/>
-      <w:bookmarkEnd w:id="144"/>
     </w:p>
     <w:p>
       <w:pPr>
@@ -24331,30 +24329,30 @@
     </w:p>
     <w:p>
       <w:pPr>
-        <w:pStyle w:val="Heading1"/>
+        <w:pStyle w:val="u1"/>
         <w:pageBreakBefore/>
       </w:pPr>
-      <w:bookmarkStart w:id="145" w:name="_Toc91071"/>
-      <w:bookmarkStart w:id="146" w:name="_Toc234651223"/>
+      <w:bookmarkStart w:id="144" w:name="_Toc91071"/>
+      <w:bookmarkStart w:id="145" w:name="_Toc234651223"/>
       <w:r>
         <w:lastRenderedPageBreak/>
         <w:t>6. KIỂM THỬ VÀ CHẤT LƯỢNG</w:t>
       </w:r>
+      <w:bookmarkEnd w:id="144"/>
       <w:bookmarkEnd w:id="145"/>
-      <w:bookmarkEnd w:id="146"/>
     </w:p>
     <w:p>
       <w:pPr>
-        <w:pStyle w:val="Heading2"/>
+        <w:pStyle w:val="u2"/>
         <w:spacing w:before="160"/>
       </w:pPr>
-      <w:bookmarkStart w:id="147" w:name="_Toc91072"/>
-      <w:bookmarkStart w:id="148" w:name="_Toc234651224"/>
+      <w:bookmarkStart w:id="146" w:name="_Toc91072"/>
+      <w:bookmarkStart w:id="147" w:name="_Toc234651224"/>
       <w:r>
         <w:t>6.1. Chiến lược kiểm thử</w:t>
       </w:r>
+      <w:bookmarkEnd w:id="146"/>
       <w:bookmarkEnd w:id="147"/>
-      <w:bookmarkEnd w:id="148"/>
     </w:p>
     <w:p>
       <w:pPr>
@@ -24406,20 +24404,20 @@
     </w:p>
     <w:p>
       <w:pPr>
-        <w:pStyle w:val="Heading2"/>
+        <w:pStyle w:val="u2"/>
         <w:spacing w:before="160"/>
       </w:pPr>
-      <w:bookmarkStart w:id="149" w:name="_Toc91073"/>
-      <w:bookmarkStart w:id="150" w:name="_Toc234651225"/>
+      <w:bookmarkStart w:id="148" w:name="_Toc91073"/>
+      <w:bookmarkStart w:id="149" w:name="_Toc234651225"/>
       <w:r>
         <w:t>6.2. Kết quả kiểm thử</w:t>
       </w:r>
+      <w:bookmarkEnd w:id="148"/>
       <w:bookmarkEnd w:id="149"/>
-      <w:bookmarkEnd w:id="150"/>
     </w:p>
     <w:tbl>
       <w:tblPr>
-        <w:tblStyle w:val="TableGrid"/>
+        <w:tblStyle w:val="LiBang"/>
         <w:tblW w:w="0" w:type="auto"/>
         <w:tblLook w:val="04A0" w:firstRow="1" w:lastRow="0" w:firstColumn="1" w:lastColumn="0" w:noHBand="0" w:noVBand="1"/>
       </w:tblPr>
@@ -24618,16 +24616,16 @@
     </w:p>
     <w:p>
       <w:pPr>
-        <w:pStyle w:val="Heading2"/>
+        <w:pStyle w:val="u2"/>
         <w:spacing w:before="160"/>
       </w:pPr>
-      <w:bookmarkStart w:id="151" w:name="_Toc91074"/>
-      <w:bookmarkStart w:id="152" w:name="_Toc234651226"/>
+      <w:bookmarkStart w:id="150" w:name="_Toc91074"/>
+      <w:bookmarkStart w:id="151" w:name="_Toc234651226"/>
       <w:r>
         <w:t>6.3. Bảo mật đã rà soát</w:t>
       </w:r>
+      <w:bookmarkEnd w:id="150"/>
       <w:bookmarkEnd w:id="151"/>
-      <w:bookmarkEnd w:id="152"/>
     </w:p>
     <w:p>
       <w:pPr>
@@ -24721,34 +24719,34 @@
     </w:p>
     <w:p>
       <w:pPr>
-        <w:pStyle w:val="Heading1"/>
+        <w:pStyle w:val="u1"/>
         <w:pageBreakBefore/>
       </w:pPr>
-      <w:bookmarkStart w:id="153" w:name="_Toc91075"/>
-      <w:bookmarkStart w:id="154" w:name="_Toc234651227"/>
+      <w:bookmarkStart w:id="152" w:name="_Toc91075"/>
+      <w:bookmarkStart w:id="153" w:name="_Toc234651227"/>
       <w:r>
         <w:lastRenderedPageBreak/>
         <w:t>7. TIÊU CHÍ HOÀN THÀNH VÀ KẾT LUẬN</w:t>
       </w:r>
+      <w:bookmarkEnd w:id="152"/>
       <w:bookmarkEnd w:id="153"/>
-      <w:bookmarkEnd w:id="154"/>
     </w:p>
     <w:p>
       <w:pPr>
-        <w:pStyle w:val="Heading2"/>
+        <w:pStyle w:val="u2"/>
         <w:spacing w:before="160"/>
       </w:pPr>
-      <w:bookmarkStart w:id="155" w:name="_Toc91076"/>
-      <w:bookmarkStart w:id="156" w:name="_Toc234651228"/>
+      <w:bookmarkStart w:id="154" w:name="_Toc91076"/>
+      <w:bookmarkStart w:id="155" w:name="_Toc234651228"/>
       <w:r>
         <w:t>7.1. Tiêu chí hoàn thành</w:t>
       </w:r>
+      <w:bookmarkEnd w:id="154"/>
       <w:bookmarkEnd w:id="155"/>
-      <w:bookmarkEnd w:id="156"/>
     </w:p>
     <w:tbl>
       <w:tblPr>
-        <w:tblStyle w:val="TableGrid"/>
+        <w:tblStyle w:val="LiBang"/>
         <w:tblW w:w="0" w:type="auto"/>
         <w:tblLook w:val="04A0" w:firstRow="1" w:lastRow="0" w:firstColumn="1" w:lastColumn="0" w:noHBand="0" w:noVBand="1"/>
       </w:tblPr>
@@ -24999,11 +24997,11 @@
     <w:p/>
     <w:p>
       <w:pPr>
-        <w:pStyle w:val="Heading2"/>
+        <w:pStyle w:val="u2"/>
         <w:spacing w:before="160"/>
       </w:pPr>
-      <w:bookmarkStart w:id="157" w:name="_Toc91077"/>
-      <w:bookmarkStart w:id="158" w:name="_Toc234651229"/>
+      <w:bookmarkStart w:id="156" w:name="_Toc91077"/>
+      <w:bookmarkStart w:id="157" w:name="_Toc234651229"/>
       <w:r>
         <w:t xml:space="preserve">7.2. </w:t>
       </w:r>
@@ -25016,12 +25014,12 @@
       <w:r>
         <w:t>ướng phát triển</w:t>
       </w:r>
+      <w:bookmarkEnd w:id="156"/>
       <w:bookmarkEnd w:id="157"/>
-      <w:bookmarkEnd w:id="158"/>
     </w:p>
     <w:tbl>
       <w:tblPr>
-        <w:tblStyle w:val="TableGrid"/>
+        <w:tblStyle w:val="LiBang"/>
         <w:tblW w:w="0" w:type="auto"/>
         <w:tblLook w:val="04A0" w:firstRow="1" w:lastRow="0" w:firstColumn="1" w:lastColumn="0" w:noHBand="0" w:noVBand="1"/>
       </w:tblPr>
@@ -25208,16 +25206,16 @@
     <w:p/>
     <w:p>
       <w:pPr>
-        <w:pStyle w:val="Heading2"/>
+        <w:pStyle w:val="u2"/>
         <w:spacing w:before="160"/>
       </w:pPr>
-      <w:bookmarkStart w:id="159" w:name="_Toc91078"/>
-      <w:bookmarkStart w:id="160" w:name="_Toc234651230"/>
+      <w:bookmarkStart w:id="158" w:name="_Toc91078"/>
+      <w:bookmarkStart w:id="159" w:name="_Toc234651230"/>
       <w:r>
         <w:t>7.3. Kết luận</w:t>
       </w:r>
+      <w:bookmarkEnd w:id="158"/>
       <w:bookmarkEnd w:id="159"/>
-      <w:bookmarkEnd w:id="160"/>
     </w:p>
     <w:p>
       <w:pPr>
@@ -25238,7 +25236,7 @@
     </w:p>
     <w:p>
       <w:pPr>
-        <w:pStyle w:val="NormalWeb"/>
+        <w:pStyle w:val="ThngthngWeb"/>
         <w:jc w:val="both"/>
         <w:rPr>
           <w:sz w:val="26"/>
@@ -25263,7 +25261,7 @@
     </w:p>
     <w:p>
       <w:pPr>
-        <w:pStyle w:val="NormalWeb"/>
+        <w:pStyle w:val="ThngthngWeb"/>
         <w:jc w:val="both"/>
         <w:rPr>
           <w:sz w:val="26"/>
@@ -25284,6 +25282,275 @@
         <w:jc w:val="both"/>
       </w:pPr>
     </w:p>
+    <w:p>
+      <w:pPr>
+        <w:pStyle w:val="u1"/>
+        <w:pageBreakBefore/>
+      </w:pPr>
+      <w:r>
+        <w:lastRenderedPageBreak/>
+        <w:t>8. TÀI LIỆU THAM KHẢO</w:t>
+      </w:r>
+    </w:p>
+    <w:p>
+      <w:r>
+        <w:rPr>
+          <w:sz w:val="26"/>
+          <w:lang w:val="vi-VN"/>
+        </w:rPr>
+        <w:t>T</w:t>
+      </w:r>
+      <w:r>
+        <w:rPr>
+          <w:sz w:val="26"/>
+        </w:rPr>
+        <w:t>ổng hợp các nguồn dữ liệu, API, dịch vụ bên ngoài và tài liệu kỹ thuật đã được sử dụng trong quá trình phân tích, thiết kế và xây dựng hệ thống Smart Travel Guide.</w:t>
+      </w:r>
+    </w:p>
+    <w:p>
+      <w:pPr>
+        <w:pStyle w:val="u2"/>
+        <w:spacing w:before="160"/>
+      </w:pPr>
+      <w:r>
+        <w:t>8.1. Nguồn dữ liệu (Dataset)</w:t>
+      </w:r>
+    </w:p>
+    <w:p>
+      <w:pPr>
+        <w:spacing w:after="60"/>
+        <w:ind w:left="397" w:hanging="198"/>
+      </w:pPr>
+      <w:r>
+        <w:rPr>
+          <w:sz w:val="26"/>
+        </w:rPr>
+        <w:t>• Dữ liệu bản đồ và địa điểm OpenStreetMap — © OpenStreetMap contributors, cấp phép theo Open Database License (ODbL). Nguồn: https://www.openstreetmap.org/copyright</w:t>
+      </w:r>
+    </w:p>
+    <w:p>
+      <w:pPr>
+        <w:spacing w:after="60"/>
+        <w:ind w:left="397" w:hanging="198"/>
+      </w:pPr>
+      <w:r>
+        <w:rPr>
+          <w:sz w:val="26"/>
+        </w:rPr>
+        <w:t>• Bộ dữ liệu khách sạn (~3.787 bản ghi) được trích xuất từ OpenStreetMap thông qua Overpass API bằng script nội bộ (scripts/import-hotels-osm.ts), lưu vào MongoDB phục vụ chức năng tìm kiếm khách sạn.</w:t>
+      </w:r>
+    </w:p>
+    <w:p>
+      <w:pPr>
+        <w:spacing w:after="60"/>
+        <w:ind w:left="397" w:hanging="198"/>
+      </w:pPr>
+      <w:r>
+        <w:rPr>
+          <w:sz w:val="26"/>
+        </w:rPr>
+        <w:t>• Dữ liệu thời tiết (hiện tại và dự báo 7 ngày) lấy từ Open-Meteo, nguồn dữ liệu khí tượng mở, miễn phí cho mục đích phi thương mại. Nguồn: https://open-meteo.com/</w:t>
+      </w:r>
+    </w:p>
+    <w:p>
+      <w:pPr>
+        <w:pStyle w:val="u2"/>
+        <w:spacing w:before="160"/>
+      </w:pPr>
+      <w:r>
+        <w:t>8.2. API và dịch vụ bên ngoài</w:t>
+      </w:r>
+    </w:p>
+    <w:p>
+      <w:pPr>
+        <w:spacing w:after="60"/>
+        <w:ind w:left="397" w:hanging="198"/>
+      </w:pPr>
+      <w:r>
+        <w:rPr>
+          <w:sz w:val="26"/>
+        </w:rPr>
+        <w:t>• Nominatim Search API — tìm kiếm và geocoding địa danh từ dữ liệu OpenStreetMap. Endpoint: https://nominatim.openstreetmap.org/search — Tài liệu: https://nominatim.org/release-docs/latest/api/Search/</w:t>
+      </w:r>
+    </w:p>
+    <w:p>
+      <w:pPr>
+        <w:spacing w:after="60"/>
+        <w:ind w:left="397" w:hanging="198"/>
+      </w:pPr>
+      <w:r>
+        <w:rPr>
+          <w:sz w:val="26"/>
+        </w:rPr>
+        <w:t>• Overpass API — truy vấn POI (điểm tham quan, di tích, nơi thờ tự...) xung quanh một tọa độ và thu thập dữ liệu khách sạn. Endpoint: https://overpass-api.de/api/interpreter — Tài liệu: https://wiki.openstreetmap.org/wiki/Overpass_API</w:t>
+      </w:r>
+    </w:p>
+    <w:p>
+      <w:pPr>
+        <w:spacing w:after="60"/>
+        <w:ind w:left="397" w:hanging="198"/>
+      </w:pPr>
+      <w:r>
+        <w:rPr>
+          <w:sz w:val="26"/>
+        </w:rPr>
+        <w:t>• Open-Meteo Forecast API — thời tiết hiện tại, dự báo 7 ngày và dữ liệu phục vụ cảnh báo thời tiết tự động. Endpoint: https://api.open-meteo.com/v1/forecast — Tài liệu: https://open-meteo.com/en/docs</w:t>
+      </w:r>
+    </w:p>
+    <w:p>
+      <w:pPr>
+        <w:spacing w:after="60"/>
+        <w:ind w:left="397" w:hanging="198"/>
+      </w:pPr>
+      <w:r>
+        <w:rPr>
+          <w:sz w:val="26"/>
+        </w:rPr>
+        <w:t>• Resend Email API — gửi email OTP (đăng ký, đặt lại mật khẩu) và email cảnh báo thời tiết cho chuyến đi. Tài liệu: https://resend.com/docs</w:t>
+      </w:r>
+    </w:p>
+    <w:p>
+      <w:pPr>
+        <w:spacing w:after="60"/>
+        <w:ind w:left="397" w:hanging="198"/>
+      </w:pPr>
+      <w:r>
+        <w:rPr>
+          <w:sz w:val="26"/>
+        </w:rPr>
+        <w:t>• Toàn bộ API bên ngoài đều là dịch vụ mở/miễn phí, được gọi từ phía server, có cache Redis và rate limit để tuân thủ chính sách sử dụng của nhà cung cấp.</w:t>
+      </w:r>
+    </w:p>
+    <w:p>
+      <w:pPr>
+        <w:pStyle w:val="u2"/>
+        <w:spacing w:before="160"/>
+      </w:pPr>
+      <w:r>
+        <w:t>8.3. Công nghệ, thư viện và tài liệu kỹ thuật</w:t>
+      </w:r>
+    </w:p>
+    <w:p>
+      <w:pPr>
+        <w:spacing w:after="60"/>
+        <w:ind w:left="397" w:hanging="198"/>
+      </w:pPr>
+      <w:r>
+        <w:rPr>
+          <w:sz w:val="26"/>
+        </w:rPr>
+        <w:t>• Next.js (App Router) — framework web full-stack: https://nextjs.org/docs</w:t>
+      </w:r>
+    </w:p>
+    <w:p>
+      <w:pPr>
+        <w:spacing w:after="60"/>
+        <w:ind w:left="397" w:hanging="198"/>
+      </w:pPr>
+      <w:r>
+        <w:rPr>
+          <w:sz w:val="26"/>
+        </w:rPr>
+        <w:t>• React — thư viện xây dựng giao diện: https://react.dev/</w:t>
+      </w:r>
+    </w:p>
+    <w:p>
+      <w:pPr>
+        <w:spacing w:after="60"/>
+        <w:ind w:left="397" w:hanging="198"/>
+      </w:pPr>
+      <w:r>
+        <w:rPr>
+          <w:sz w:val="26"/>
+        </w:rPr>
+        <w:t>• TypeScript — ngôn ngữ lập trình: https://www.typescriptlang.org/docs/</w:t>
+      </w:r>
+    </w:p>
+    <w:p>
+      <w:pPr>
+        <w:spacing w:after="60"/>
+        <w:ind w:left="397" w:hanging="198"/>
+      </w:pPr>
+      <w:r>
+        <w:rPr>
+          <w:sz w:val="26"/>
+        </w:rPr>
+        <w:t>• Tailwind CSS — framework CSS utility-first: https://tailwindcss.com/docs</w:t>
+      </w:r>
+    </w:p>
+    <w:p>
+      <w:pPr>
+        <w:spacing w:after="60"/>
+        <w:ind w:left="397" w:hanging="198"/>
+      </w:pPr>
+      <w:r>
+        <w:rPr>
+          <w:sz w:val="26"/>
+        </w:rPr>
+        <w:t>• MongoDB và Mongoose — cơ sở dữ liệu chính và ODM: https://www.mongodb.com/docs/ ; https://mongoosejs.com/docs/</w:t>
+      </w:r>
+    </w:p>
+    <w:p>
+      <w:pPr>
+        <w:spacing w:after="60"/>
+        <w:ind w:left="397" w:hanging="198"/>
+      </w:pPr>
+      <w:r>
+        <w:rPr>
+          <w:sz w:val="26"/>
+        </w:rPr>
+        <w:lastRenderedPageBreak/>
+        <w:t>• Redis và ioredis — cache, OTP, rate limit, JWT blacklist: https://redis.io/docs/ ; https://github.com/redis/ioredis</w:t>
+      </w:r>
+    </w:p>
+    <w:p>
+      <w:pPr>
+        <w:spacing w:after="60"/>
+        <w:ind w:left="397" w:hanging="198"/>
+      </w:pPr>
+      <w:r>
+        <w:rPr>
+          <w:sz w:val="26"/>
+        </w:rPr>
+        <w:t>• Zod — kiểm tra và xác thực dữ liệu đầu vào: https://zod.dev/</w:t>
+      </w:r>
+    </w:p>
+    <w:p>
+      <w:pPr>
+        <w:spacing w:after="60"/>
+        <w:ind w:left="397" w:hanging="198"/>
+      </w:pPr>
+      <w:r>
+        <w:rPr>
+          <w:sz w:val="26"/>
+        </w:rPr>
+        <w:t>• jose — ký và xác thực JWT: https://github.com/panva/jose</w:t>
+      </w:r>
+    </w:p>
+    <w:p>
+      <w:pPr>
+        <w:spacing w:after="60"/>
+        <w:ind w:left="397" w:hanging="198"/>
+      </w:pPr>
+      <w:r>
+        <w:rPr>
+          <w:sz w:val="26"/>
+        </w:rPr>
+        <w:t>• Vitest và Testing Library — kiểm thử đơn vị, tích hợp và giao diện: https://vitest.dev/ ; https://testing-library.com/docs/</w:t>
+      </w:r>
+    </w:p>
+    <w:p>
+      <w:pPr>
+        <w:spacing w:after="60"/>
+        <w:ind w:left="397" w:hanging="198"/>
+      </w:pPr>
+      <w:r>
+        <w:rPr>
+          <w:sz w:val="26"/>
+        </w:rPr>
+        <w:t>• Docker Compose — chạy MongoDB và Redis cục bộ: https://docs.docker.com/compose/</w:t>
+      </w:r>
+    </w:p>
     <w:sectPr>
       <w:footerReference w:type="default" r:id="rId19"/>
       <w:pgSz w:w="11909" w:h="16834"/>
@@ -25297,7 +25564,7 @@
 </file>
 
 <file path=word/endnotes.xml><?xml version="1.0" encoding="utf-8"?>
-<w:endnotes xmlns:wpc="http://schemas.microsoft.com/office/word/2010/wordprocessingCanvas" xmlns:cx="http://schemas.microsoft.com/office/drawing/2014/chartex" xmlns:mc="http://schemas.openxmlformats.org/markup-compatibility/2006" xmlns:o="urn:schemas-microsoft-com:office:office" xmlns:r="http://schemas.openxmlformats.org/officeDocument/2006/relationships" xmlns:m="http://schemas.openxmlformats.org/officeDocument/2006/math" xmlns:v="urn:schemas-microsoft-com:vml" xmlns:wp14="http://schemas.microsoft.com/office/word/2010/wordprocessingDrawing" xmlns:wp="http://schemas.openxmlformats.org/drawingml/2006/wordprocessingDrawing" xmlns:w10="urn:schemas-microsoft-com:office:word" xmlns:w="http://schemas.openxmlformats.org/wordprocessingml/2006/main" xmlns:w14="http://schemas.microsoft.com/office/word/2010/wordml" xmlns:w15="http://schemas.microsoft.com/office/word/2012/wordml" xmlns:w16se="http://schemas.microsoft.com/office/word/2015/wordml/symex" xmlns:wpg="http://schemas.microsoft.com/office/word/2010/wordprocessingGroup" xmlns:wpi="http://schemas.microsoft.com/office/word/2010/wordprocessingInk" xmlns:wne="http://schemas.microsoft.com/office/word/2006/wordml" xmlns:wps="http://schemas.microsoft.com/office/word/2010/wordprocessingShape" mc:Ignorable="w14 w15 w16se wp14">
+<w:endnotes xmlns:wpc="http://schemas.microsoft.com/office/word/2010/wordprocessingCanvas" xmlns:cx="http://schemas.microsoft.com/office/drawing/2014/chartex" xmlns:cx1="http://schemas.microsoft.com/office/drawing/2015/9/8/chartex" xmlns:cx2="http://schemas.microsoft.com/office/drawing/2015/10/21/chartex" xmlns:cx3="http://schemas.microsoft.com/office/drawing/2016/5/9/chartex" xmlns:cx4="http://schemas.microsoft.com/office/drawing/2016/5/10/chartex" xmlns:cx5="http://schemas.microsoft.com/office/drawing/2016/5/11/chartex" xmlns:cx6="http://schemas.microsoft.com/office/drawing/2016/5/12/chartex" xmlns:cx7="http://schemas.microsoft.com/office/drawing/2016/5/13/chartex" xmlns:cx8="http://schemas.microsoft.com/office/drawing/2016/5/14/chartex" xmlns:mc="http://schemas.openxmlformats.org/markup-compatibility/2006" xmlns:aink="http://schemas.microsoft.com/office/drawing/2016/ink" xmlns:am3d="http://schemas.microsoft.com/office/drawing/2017/model3d" xmlns:o="urn:schemas-microsoft-com:office:office" xmlns:oel="http://schemas.microsoft.com/office/2019/extlst" xmlns:r="http://schemas.openxmlformats.org/officeDocument/2006/relationships" xmlns:m="http://schemas.openxmlformats.org/officeDocument/2006/math" xmlns:v="urn:schemas-microsoft-com:vml" xmlns:wp14="http://schemas.microsoft.com/office/word/2010/wordprocessingDrawing" xmlns:wp="http://schemas.openxmlformats.org/drawingml/2006/wordprocessingDrawing" xmlns:w10="urn:schemas-microsoft-com:office:word" xmlns:w="http://schemas.openxmlformats.org/wordprocessingml/2006/main" xmlns:w14="http://schemas.microsoft.com/office/word/2010/wordml" xmlns:w15="http://schemas.microsoft.com/office/word/2012/wordml" xmlns:w16cex="http://schemas.microsoft.com/office/word/2018/wordml/cex" xmlns:w16cid="http://schemas.microsoft.com/office/word/2016/wordml/cid" xmlns:w16="http://schemas.microsoft.com/office/word/2018/wordml" xmlns:w16du="http://schemas.microsoft.com/office/word/2023/wordml/word16du" xmlns:w16sdtdh="http://schemas.microsoft.com/office/word/2020/wordml/sdtdatahash" xmlns:w16sdtfl="http://schemas.microsoft.com/office/word/2024/wordml/sdtformatlock" xmlns:w16se="http://schemas.microsoft.com/office/word/2015/wordml/symex" xmlns:wpg="http://schemas.microsoft.com/office/word/2010/wordprocessingGroup" xmlns:wpi="http://schemas.microsoft.com/office/word/2010/wordprocessingInk" xmlns:wne="http://schemas.microsoft.com/office/word/2006/wordml" xmlns:wps="http://schemas.microsoft.com/office/word/2010/wordprocessingShape" mc:Ignorable="w14 w15 w16se w16cid w16 w16cex w16sdtdh w16sdtfl w16du wp14">
   <w:endnote w:type="separator" w:id="-1">
     <w:p>
       <w:pPr>
@@ -25322,7 +25589,7 @@
 </file>
 
 <file path=word/footer1.xml><?xml version="1.0" encoding="utf-8"?>
-<w:ftr xmlns:wpc="http://schemas.microsoft.com/office/word/2010/wordprocessingCanvas" xmlns:cx="http://schemas.microsoft.com/office/drawing/2014/chartex" xmlns:mc="http://schemas.openxmlformats.org/markup-compatibility/2006" xmlns:o="urn:schemas-microsoft-com:office:office" xmlns:r="http://schemas.openxmlformats.org/officeDocument/2006/relationships" xmlns:m="http://schemas.openxmlformats.org/officeDocument/2006/math" xmlns:v="urn:schemas-microsoft-com:vml" xmlns:wp14="http://schemas.microsoft.com/office/word/2010/wordprocessingDrawing" xmlns:wp="http://schemas.openxmlformats.org/drawingml/2006/wordprocessingDrawing" xmlns:w10="urn:schemas-microsoft-com:office:word" xmlns:w="http://schemas.openxmlformats.org/wordprocessingml/2006/main" xmlns:w14="http://schemas.microsoft.com/office/word/2010/wordml" xmlns:w15="http://schemas.microsoft.com/office/word/2012/wordml" xmlns:w16se="http://schemas.microsoft.com/office/word/2015/wordml/symex" xmlns:wpg="http://schemas.microsoft.com/office/word/2010/wordprocessingGroup" xmlns:wpi="http://schemas.microsoft.com/office/word/2010/wordprocessingInk" xmlns:wne="http://schemas.microsoft.com/office/word/2006/wordml" xmlns:wps="http://schemas.microsoft.com/office/word/2010/wordprocessingShape" mc:Ignorable="w14 w15 w16se wp14">
+<w:ftr xmlns:wpc="http://schemas.microsoft.com/office/word/2010/wordprocessingCanvas" xmlns:cx="http://schemas.microsoft.com/office/drawing/2014/chartex" xmlns:cx1="http://schemas.microsoft.com/office/drawing/2015/9/8/chartex" xmlns:cx2="http://schemas.microsoft.com/office/drawing/2015/10/21/chartex" xmlns:cx3="http://schemas.microsoft.com/office/drawing/2016/5/9/chartex" xmlns:cx4="http://schemas.microsoft.com/office/drawing/2016/5/10/chartex" xmlns:cx5="http://schemas.microsoft.com/office/drawing/2016/5/11/chartex" xmlns:cx6="http://schemas.microsoft.com/office/drawing/2016/5/12/chartex" xmlns:cx7="http://schemas.microsoft.com/office/drawing/2016/5/13/chartex" xmlns:cx8="http://schemas.microsoft.com/office/drawing/2016/5/14/chartex" xmlns:mc="http://schemas.openxmlformats.org/markup-compatibility/2006" xmlns:aink="http://schemas.microsoft.com/office/drawing/2016/ink" xmlns:am3d="http://schemas.microsoft.com/office/drawing/2017/model3d" xmlns:o="urn:schemas-microsoft-com:office:office" xmlns:oel="http://schemas.microsoft.com/office/2019/extlst" xmlns:r="http://schemas.openxmlformats.org/officeDocument/2006/relationships" xmlns:m="http://schemas.openxmlformats.org/officeDocument/2006/math" xmlns:v="urn:schemas-microsoft-com:vml" xmlns:wp14="http://schemas.microsoft.com/office/word/2010/wordprocessingDrawing" xmlns:wp="http://schemas.openxmlformats.org/drawingml/2006/wordprocessingDrawing" xmlns:w10="urn:schemas-microsoft-com:office:word" xmlns:w="http://schemas.openxmlformats.org/wordprocessingml/2006/main" xmlns:w14="http://schemas.microsoft.com/office/word/2010/wordml" xmlns:w15="http://schemas.microsoft.com/office/word/2012/wordml" xmlns:w16cex="http://schemas.microsoft.com/office/word/2018/wordml/cex" xmlns:w16cid="http://schemas.microsoft.com/office/word/2016/wordml/cid" xmlns:w16="http://schemas.microsoft.com/office/word/2018/wordml" xmlns:w16du="http://schemas.microsoft.com/office/word/2023/wordml/word16du" xmlns:w16sdtdh="http://schemas.microsoft.com/office/word/2020/wordml/sdtdatahash" xmlns:w16sdtfl="http://schemas.microsoft.com/office/word/2024/wordml/sdtformatlock" xmlns:w16se="http://schemas.microsoft.com/office/word/2015/wordml/symex" xmlns:wpg="http://schemas.microsoft.com/office/word/2010/wordprocessingGroup" xmlns:wpi="http://schemas.microsoft.com/office/word/2010/wordprocessingInk" xmlns:wne="http://schemas.microsoft.com/office/word/2006/wordml" xmlns:wps="http://schemas.microsoft.com/office/word/2010/wordprocessingShape" mc:Ignorable="w14 w15 w16se w16cid w16 w16cex w16sdtdh w16sdtfl w16du wp14">
   <w:p>
     <w:pPr>
       <w:jc w:val="center"/>
@@ -25353,7 +25620,7 @@
 </file>
 
 <file path=word/footnotes.xml><?xml version="1.0" encoding="utf-8"?>
-<w:footnotes xmlns:wpc="http://schemas.microsoft.com/office/word/2010/wordprocessingCanvas" xmlns:cx="http://schemas.microsoft.com/office/drawing/2014/chartex" xmlns:mc="http://schemas.openxmlformats.org/markup-compatibility/2006" xmlns:o="urn:schemas-microsoft-com:office:office" xmlns:r="http://schemas.openxmlformats.org/officeDocument/2006/relationships" xmlns:m="http://schemas.openxmlformats.org/officeDocument/2006/math" xmlns:v="urn:schemas-microsoft-com:vml" xmlns:wp14="http://schemas.microsoft.com/office/word/2010/wordprocessingDrawing" xmlns:wp="http://schemas.openxmlformats.org/drawingml/2006/wordprocessingDrawing" xmlns:w10="urn:schemas-microsoft-com:office:word" xmlns:w="http://schemas.openxmlformats.org/wordprocessingml/2006/main" xmlns:w14="http://schemas.microsoft.com/office/word/2010/wordml" xmlns:w15="http://schemas.microsoft.com/office/word/2012/wordml" xmlns:w16se="http://schemas.microsoft.com/office/word/2015/wordml/symex" xmlns:wpg="http://schemas.microsoft.com/office/word/2010/wordprocessingGroup" xmlns:wpi="http://schemas.microsoft.com/office/word/2010/wordprocessingInk" xmlns:wne="http://schemas.microsoft.com/office/word/2006/wordml" xmlns:wps="http://schemas.microsoft.com/office/word/2010/wordprocessingShape" mc:Ignorable="w14 w15 w16se wp14">
+<w:footnotes xmlns:wpc="http://schemas.microsoft.com/office/word/2010/wordprocessingCanvas" xmlns:cx="http://schemas.microsoft.com/office/drawing/2014/chartex" xmlns:cx1="http://schemas.microsoft.com/office/drawing/2015/9/8/chartex" xmlns:cx2="http://schemas.microsoft.com/office/drawing/2015/10/21/chartex" xmlns:cx3="http://schemas.microsoft.com/office/drawing/2016/5/9/chartex" xmlns:cx4="http://schemas.microsoft.com/office/drawing/2016/5/10/chartex" xmlns:cx5="http://schemas.microsoft.com/office/drawing/2016/5/11/chartex" xmlns:cx6="http://schemas.microsoft.com/office/drawing/2016/5/12/chartex" xmlns:cx7="http://schemas.microsoft.com/office/drawing/2016/5/13/chartex" xmlns:cx8="http://schemas.microsoft.com/office/drawing/2016/5/14/chartex" xmlns:mc="http://schemas.openxmlformats.org/markup-compatibility/2006" xmlns:aink="http://schemas.microsoft.com/office/drawing/2016/ink" xmlns:am3d="http://schemas.microsoft.com/office/drawing/2017/model3d" xmlns:o="urn:schemas-microsoft-com:office:office" xmlns:oel="http://schemas.microsoft.com/office/2019/extlst" xmlns:r="http://schemas.openxmlformats.org/officeDocument/2006/relationships" xmlns:m="http://schemas.openxmlformats.org/officeDocument/2006/math" xmlns:v="urn:schemas-microsoft-com:vml" xmlns:wp14="http://schemas.microsoft.com/office/word/2010/wordprocessingDrawing" xmlns:wp="http://schemas.openxmlformats.org/drawingml/2006/wordprocessingDrawing" xmlns:w10="urn:schemas-microsoft-com:office:word" xmlns:w="http://schemas.openxmlformats.org/wordprocessingml/2006/main" xmlns:w14="http://schemas.microsoft.com/office/word/2010/wordml" xmlns:w15="http://schemas.microsoft.com/office/word/2012/wordml" xmlns:w16cex="http://schemas.microsoft.com/office/word/2018/wordml/cex" xmlns:w16cid="http://schemas.microsoft.com/office/word/2016/wordml/cid" xmlns:w16="http://schemas.microsoft.com/office/word/2018/wordml" xmlns:w16du="http://schemas.microsoft.com/office/word/2023/wordml/word16du" xmlns:w16sdtdh="http://schemas.microsoft.com/office/word/2020/wordml/sdtdatahash" xmlns:w16sdtfl="http://schemas.microsoft.com/office/word/2024/wordml/sdtformatlock" xmlns:w16se="http://schemas.microsoft.com/office/word/2015/wordml/symex" xmlns:wpg="http://schemas.microsoft.com/office/word/2010/wordprocessingGroup" xmlns:wpi="http://schemas.microsoft.com/office/word/2010/wordprocessingInk" xmlns:wne="http://schemas.microsoft.com/office/word/2006/wordml" xmlns:wps="http://schemas.microsoft.com/office/word/2010/wordprocessingShape" mc:Ignorable="w14 w15 w16se w16cid w16 w16cex w16sdtdh w16sdtfl w16du wp14">
   <w:footnote w:type="separator" w:id="-1">
     <w:p>
       <w:pPr>
@@ -25378,7 +25645,7 @@
 </file>
 
 <file path=word/styles.xml><?xml version="1.0" encoding="utf-8"?>
-<w:styles xmlns:mc="http://schemas.openxmlformats.org/markup-compatibility/2006" xmlns:r="http://schemas.openxmlformats.org/officeDocument/2006/relationships" xmlns:w="http://schemas.openxmlformats.org/wordprocessingml/2006/main" xmlns:w14="http://schemas.microsoft.com/office/word/2010/wordml" xmlns:w15="http://schemas.microsoft.com/office/word/2012/wordml" xmlns:w16se="http://schemas.microsoft.com/office/word/2015/wordml/symex" mc:Ignorable="w14 w15 w16se">
+<w:styles xmlns:mc="http://schemas.openxmlformats.org/markup-compatibility/2006" xmlns:r="http://schemas.openxmlformats.org/officeDocument/2006/relationships" xmlns:w="http://schemas.openxmlformats.org/wordprocessingml/2006/main" xmlns:w14="http://schemas.microsoft.com/office/word/2010/wordml" xmlns:w15="http://schemas.microsoft.com/office/word/2012/wordml" xmlns:w16cex="http://schemas.microsoft.com/office/word/2018/wordml/cex" xmlns:w16cid="http://schemas.microsoft.com/office/word/2016/wordml/cid" xmlns:w16="http://schemas.microsoft.com/office/word/2018/wordml" xmlns:w16du="http://schemas.microsoft.com/office/word/2023/wordml/word16du" xmlns:w16sdtdh="http://schemas.microsoft.com/office/word/2020/wordml/sdtdatahash" xmlns:w16sdtfl="http://schemas.microsoft.com/office/word/2024/wordml/sdtformatlock" xmlns:w16se="http://schemas.microsoft.com/office/word/2015/wordml/symex" mc:Ignorable="w14 w15 w16se w16cid w16 w16cex w16sdtdh w16sdtfl w16du">
   <w:docDefaults>
     <w:rPrDefault>
       <w:rPr>
@@ -25394,7 +25661,7 @@
       </w:pPr>
     </w:pPrDefault>
   </w:docDefaults>
-  <w:latentStyles w:defLockedState="0" w:defUIPriority="99" w:defSemiHidden="0" w:defUnhideWhenUsed="0" w:defQFormat="0" w:count="371">
+  <w:latentStyles w:defLockedState="0" w:defUIPriority="99" w:defSemiHidden="0" w:defUnhideWhenUsed="0" w:defQFormat="0" w:count="376">
     <w:lsdException w:name="Normal" w:uiPriority="0" w:qFormat="1"/>
     <w:lsdException w:name="heading 1" w:uiPriority="9" w:qFormat="1"/>
     <w:lsdException w:name="heading 2" w:semiHidden="1" w:uiPriority="9" w:unhideWhenUsed="1" w:qFormat="1"/>
@@ -25766,16 +26033,21 @@
     <w:lsdException w:name="List Table 5 Dark Accent 6" w:uiPriority="50"/>
     <w:lsdException w:name="List Table 6 Colorful Accent 6" w:uiPriority="51"/>
     <w:lsdException w:name="List Table 7 Colorful Accent 6" w:uiPriority="52"/>
+    <w:lsdException w:name="Mention" w:semiHidden="1" w:unhideWhenUsed="1"/>
+    <w:lsdException w:name="Smart Hyperlink" w:semiHidden="1" w:unhideWhenUsed="1"/>
+    <w:lsdException w:name="Hashtag" w:semiHidden="1" w:unhideWhenUsed="1"/>
+    <w:lsdException w:name="Unresolved Mention" w:semiHidden="1" w:unhideWhenUsed="1"/>
+    <w:lsdException w:name="Smart Link" w:semiHidden="1" w:unhideWhenUsed="1"/>
   </w:latentStyles>
-  <w:style w:type="paragraph" w:default="1" w:styleId="Normal">
+  <w:style w:type="paragraph" w:default="1" w:styleId="Binhthng">
     <w:name w:val="Normal"/>
     <w:qFormat/>
     <w:rsid w:val="00990194"/>
   </w:style>
-  <w:style w:type="paragraph" w:styleId="Heading1">
+  <w:style w:type="paragraph" w:styleId="u1">
     <w:name w:val="heading 1"/>
-    <w:basedOn w:val="Normal"/>
-    <w:next w:val="Normal"/>
+    <w:basedOn w:val="Binhthng"/>
+    <w:next w:val="Binhthng"/>
     <w:uiPriority w:val="9"/>
     <w:qFormat/>
     <w:pPr>
@@ -25792,10 +26064,10 @@
       <w:szCs w:val="28"/>
     </w:rPr>
   </w:style>
-  <w:style w:type="paragraph" w:styleId="Heading2">
+  <w:style w:type="paragraph" w:styleId="u2">
     <w:name w:val="heading 2"/>
-    <w:basedOn w:val="Normal"/>
-    <w:next w:val="Normal"/>
+    <w:basedOn w:val="Binhthng"/>
+    <w:next w:val="Binhthng"/>
     <w:uiPriority w:val="9"/>
     <w:semiHidden/>
     <w:unhideWhenUsed/>
@@ -25813,10 +26085,10 @@
       <w:szCs w:val="26"/>
     </w:rPr>
   </w:style>
-  <w:style w:type="paragraph" w:styleId="Heading3">
+  <w:style w:type="paragraph" w:styleId="u3">
     <w:name w:val="heading 3"/>
-    <w:basedOn w:val="Normal"/>
-    <w:next w:val="Normal"/>
+    <w:basedOn w:val="Binhthng"/>
+    <w:next w:val="Binhthng"/>
     <w:uiPriority w:val="9"/>
     <w:semiHidden/>
     <w:unhideWhenUsed/>
@@ -25835,10 +26107,10 @@
       <w:szCs w:val="26"/>
     </w:rPr>
   </w:style>
-  <w:style w:type="paragraph" w:styleId="Heading4">
+  <w:style w:type="paragraph" w:styleId="u4">
     <w:name w:val="heading 4"/>
-    <w:basedOn w:val="Normal"/>
-    <w:next w:val="Normal"/>
+    <w:basedOn w:val="Binhthng"/>
+    <w:next w:val="Binhthng"/>
     <w:uiPriority w:val="9"/>
     <w:semiHidden/>
     <w:unhideWhenUsed/>
@@ -25855,10 +26127,10 @@
       <w:szCs w:val="24"/>
     </w:rPr>
   </w:style>
-  <w:style w:type="paragraph" w:styleId="Heading5">
+  <w:style w:type="paragraph" w:styleId="u5">
     <w:name w:val="heading 5"/>
-    <w:basedOn w:val="Normal"/>
-    <w:next w:val="Normal"/>
+    <w:basedOn w:val="Binhthng"/>
+    <w:next w:val="Binhthng"/>
     <w:uiPriority w:val="9"/>
     <w:semiHidden/>
     <w:unhideWhenUsed/>
@@ -25873,10 +26145,10 @@
       <w:color w:val="666666"/>
     </w:rPr>
   </w:style>
-  <w:style w:type="paragraph" w:styleId="Heading6">
+  <w:style w:type="paragraph" w:styleId="u6">
     <w:name w:val="heading 6"/>
-    <w:basedOn w:val="Normal"/>
-    <w:next w:val="Normal"/>
+    <w:basedOn w:val="Binhthng"/>
+    <w:next w:val="Binhthng"/>
     <w:uiPriority w:val="9"/>
     <w:semiHidden/>
     <w:unhideWhenUsed/>
@@ -25893,13 +26165,13 @@
       <w:color w:val="666666"/>
     </w:rPr>
   </w:style>
-  <w:style w:type="character" w:default="1" w:styleId="DefaultParagraphFont">
+  <w:style w:type="character" w:default="1" w:styleId="Phngmcinhcuaoanvn">
     <w:name w:val="Default Paragraph Font"/>
     <w:uiPriority w:val="1"/>
     <w:semiHidden/>
     <w:unhideWhenUsed/>
   </w:style>
-  <w:style w:type="table" w:default="1" w:styleId="TableNormal">
+  <w:style w:type="table" w:default="1" w:styleId="BangThngthng">
     <w:name w:val="Normal Table"/>
     <w:uiPriority w:val="99"/>
     <w:semiHidden/>
@@ -25914,13 +26186,13 @@
       </w:tblCellMar>
     </w:tblPr>
   </w:style>
-  <w:style w:type="numbering" w:default="1" w:styleId="NoList">
+  <w:style w:type="numbering" w:default="1" w:styleId="Khngco">
     <w:name w:val="No List"/>
     <w:uiPriority w:val="99"/>
     <w:semiHidden/>
     <w:unhideWhenUsed/>
   </w:style>
-  <w:style w:type="table" w:customStyle="1" w:styleId="TableNormal0">
+  <w:style w:type="table" w:customStyle="1" w:styleId="TableNormal">
     <w:name w:val="TableNormal"/>
     <w:tblPr>
       <w:tblCellMar>
@@ -25931,10 +26203,10 @@
       </w:tblCellMar>
     </w:tblPr>
   </w:style>
-  <w:style w:type="paragraph" w:styleId="Title">
+  <w:style w:type="paragraph" w:styleId="Tiu">
     <w:name w:val="Title"/>
-    <w:basedOn w:val="Normal"/>
-    <w:next w:val="Normal"/>
+    <w:basedOn w:val="Binhthng"/>
+    <w:next w:val="Binhthng"/>
     <w:uiPriority w:val="10"/>
     <w:qFormat/>
     <w:pPr>
@@ -25947,10 +26219,10 @@
       <w:szCs w:val="52"/>
     </w:rPr>
   </w:style>
-  <w:style w:type="paragraph" w:styleId="Subtitle">
+  <w:style w:type="paragraph" w:styleId="Tiuphu">
     <w:name w:val="Subtitle"/>
-    <w:basedOn w:val="Normal"/>
-    <w:next w:val="Normal"/>
+    <w:basedOn w:val="Binhthng"/>
+    <w:next w:val="Binhthng"/>
     <w:uiPriority w:val="11"/>
     <w:qFormat/>
     <w:pPr>
@@ -25964,9 +26236,9 @@
       <w:szCs w:val="30"/>
     </w:rPr>
   </w:style>
-  <w:style w:type="paragraph" w:styleId="ListParagraph">
+  <w:style w:type="paragraph" w:styleId="oancuaDanhsach">
     <w:name w:val="List Paragraph"/>
-    <w:basedOn w:val="Normal"/>
+    <w:basedOn w:val="Binhthng"/>
     <w:uiPriority w:val="34"/>
     <w:qFormat/>
     <w:rsid w:val="008E1422"/>
@@ -25984,9 +26256,9 @@
       <w:lang w:val="en-US" w:eastAsia="en-US"/>
     </w:rPr>
   </w:style>
-  <w:style w:type="table" w:styleId="TableGrid">
+  <w:style w:type="table" w:styleId="LiBang">
     <w:name w:val="Table Grid"/>
-    <w:basedOn w:val="TableNormal"/>
+    <w:basedOn w:val="BangThngthng"/>
     <w:uiPriority w:val="39"/>
     <w:rsid w:val="00990194"/>
     <w:pPr>
@@ -26003,10 +26275,10 @@
       </w:tblBorders>
     </w:tblPr>
   </w:style>
-  <w:style w:type="paragraph" w:styleId="Header">
+  <w:style w:type="paragraph" w:styleId="utrang">
     <w:name w:val="header"/>
-    <w:basedOn w:val="Normal"/>
-    <w:link w:val="HeaderChar"/>
+    <w:basedOn w:val="Binhthng"/>
+    <w:link w:val="utrangChar"/>
     <w:uiPriority w:val="99"/>
     <w:unhideWhenUsed/>
     <w:rsid w:val="00990194"/>
@@ -26018,17 +26290,17 @@
       <w:spacing w:line="240" w:lineRule="auto"/>
     </w:pPr>
   </w:style>
-  <w:style w:type="character" w:customStyle="1" w:styleId="HeaderChar">
-    <w:name w:val="Header Char"/>
-    <w:basedOn w:val="DefaultParagraphFont"/>
-    <w:link w:val="Header"/>
+  <w:style w:type="character" w:customStyle="1" w:styleId="utrangChar">
+    <w:name w:val="Đầu trang Char"/>
+    <w:basedOn w:val="Phngmcinhcuaoanvn"/>
+    <w:link w:val="utrang"/>
     <w:uiPriority w:val="99"/>
     <w:rsid w:val="00990194"/>
   </w:style>
-  <w:style w:type="paragraph" w:styleId="Footer">
+  <w:style w:type="paragraph" w:styleId="Chntrang">
     <w:name w:val="footer"/>
-    <w:basedOn w:val="Normal"/>
-    <w:link w:val="FooterChar"/>
+    <w:basedOn w:val="Binhthng"/>
+    <w:link w:val="ChntrangChar"/>
     <w:uiPriority w:val="99"/>
     <w:unhideWhenUsed/>
     <w:rsid w:val="00990194"/>
@@ -26040,17 +26312,17 @@
       <w:spacing w:line="240" w:lineRule="auto"/>
     </w:pPr>
   </w:style>
-  <w:style w:type="character" w:customStyle="1" w:styleId="FooterChar">
-    <w:name w:val="Footer Char"/>
-    <w:basedOn w:val="DefaultParagraphFont"/>
-    <w:link w:val="Footer"/>
+  <w:style w:type="character" w:customStyle="1" w:styleId="ChntrangChar">
+    <w:name w:val="Chân trang Char"/>
+    <w:basedOn w:val="Phngmcinhcuaoanvn"/>
+    <w:link w:val="Chntrang"/>
     <w:uiPriority w:val="99"/>
     <w:rsid w:val="00990194"/>
   </w:style>
-  <w:style w:type="paragraph" w:styleId="TOC1">
+  <w:style w:type="paragraph" w:styleId="Mucluc1">
     <w:name w:val="toc 1"/>
-    <w:basedOn w:val="Normal"/>
-    <w:next w:val="Normal"/>
+    <w:basedOn w:val="Binhthng"/>
+    <w:next w:val="Binhthng"/>
     <w:autoRedefine/>
     <w:uiPriority w:val="39"/>
     <w:unhideWhenUsed/>
@@ -26059,10 +26331,10 @@
       <w:spacing w:after="100"/>
     </w:pPr>
   </w:style>
-  <w:style w:type="paragraph" w:styleId="TOC2">
+  <w:style w:type="paragraph" w:styleId="Mucluc2">
     <w:name w:val="toc 2"/>
-    <w:basedOn w:val="Normal"/>
-    <w:next w:val="Normal"/>
+    <w:basedOn w:val="Binhthng"/>
+    <w:next w:val="Binhthng"/>
     <w:autoRedefine/>
     <w:uiPriority w:val="39"/>
     <w:unhideWhenUsed/>
@@ -26072,10 +26344,10 @@
       <w:ind w:left="220"/>
     </w:pPr>
   </w:style>
-  <w:style w:type="paragraph" w:styleId="TOC3">
+  <w:style w:type="paragraph" w:styleId="Mucluc3">
     <w:name w:val="toc 3"/>
-    <w:basedOn w:val="Normal"/>
-    <w:next w:val="Normal"/>
+    <w:basedOn w:val="Binhthng"/>
+    <w:next w:val="Binhthng"/>
     <w:autoRedefine/>
     <w:uiPriority w:val="39"/>
     <w:unhideWhenUsed/>
@@ -26085,9 +26357,9 @@
       <w:ind w:left="440"/>
     </w:pPr>
   </w:style>
-  <w:style w:type="character" w:styleId="Hyperlink">
+  <w:style w:type="character" w:styleId="Siuktni">
     <w:name w:val="Hyperlink"/>
-    <w:basedOn w:val="DefaultParagraphFont"/>
+    <w:basedOn w:val="Phngmcinhcuaoanvn"/>
     <w:uiPriority w:val="99"/>
     <w:unhideWhenUsed/>
     <w:rsid w:val="00816DEF"/>
@@ -26098,7 +26370,7 @@
   </w:style>
   <w:style w:type="paragraph" w:customStyle="1" w:styleId="pdq2pgselectionanchorcontainer">
     <w:name w:val="pdq2pg_selectionanchorcontainer"/>
-    <w:basedOn w:val="Normal"/>
+    <w:basedOn w:val="Binhthng"/>
     <w:rsid w:val="007E0A84"/>
     <w:pPr>
       <w:spacing w:before="100" w:beforeAutospacing="1" w:after="100" w:afterAutospacing="1" w:line="240" w:lineRule="auto"/>
@@ -26109,9 +26381,9 @@
       <w:lang w:val="en-US" w:eastAsia="en-US"/>
     </w:rPr>
   </w:style>
-  <w:style w:type="paragraph" w:styleId="NormalWeb">
+  <w:style w:type="paragraph" w:styleId="ThngthngWeb">
     <w:name w:val="Normal (Web)"/>
-    <w:basedOn w:val="Normal"/>
+    <w:basedOn w:val="Binhthng"/>
     <w:uiPriority w:val="99"/>
     <w:semiHidden/>
     <w:unhideWhenUsed/>

</xml_diff>